<commit_message>
docs(planificacion): actualizar los pilares y el anexo A, y subir los diagramas
</commit_message>
<xml_diff>
--- a/docs/planificacion/Pilar2_AnexoA_Modelo_de_Datos.docx
+++ b/docs/planificacion/Pilar2_AnexoA_Modelo_de_Datos.docx
@@ -214,7 +214,7 @@
                 <w:sz w:val="17"/>
                 <w:szCs w:val="17"/>
               </w:rPr>
-              <w:t>1.3</w:t>
+              <w:t>1.4</w:t>
             </w:r>
           </w:p>
         </w:tc>
@@ -262,7 +262,7 @@
                 <w:sz w:val="17"/>
                 <w:szCs w:val="17"/>
               </w:rPr>
-              <w:t>14 de septiembre de 2026</w:t>
+              <w:t>25 de septiembre de 2026</w:t>
             </w:r>
           </w:p>
         </w:tc>
@@ -312,7 +312,7 @@
                 <w:sz w:val="17"/>
                 <w:szCs w:val="17"/>
               </w:rPr>
-              <w:t>Pilar 2 — Diseño y Arquitectura, versión 1.3 (sección 6) · Pilar 1 — Alcance, versión 1.3 (secciones 3.5 y 3.6)</w:t>
+              <w:t>Pilar 2 — Diseño y Arquitectura, versión 1.7 (secciones 6 y 7) · Pilar 1 — Alcance, versión 1.7 (secciones 3.5 y 3.6)</w:t>
             </w:r>
           </w:p>
         </w:tc>
@@ -410,7 +410,7 @@
                 <w:sz w:val="17"/>
                 <w:szCs w:val="17"/>
               </w:rPr>
-              <w:t>Aprobado por el equipo el 14 de septiembre de 2026. Los trece ajustes de la sección 3 quedaron aceptados y la sección 6 del Pilar 2, en su versión 1.5, remite a este anexo en lugar de repetir los atributos. La versión 1.3 precisa cuándo nace la fila de usuario_ref, que la versión anterior ataba a declarar un perfil de tutor y dejaba sin fila a quien solo solicita tutorías. Este documento es la fuente del esquema: las migraciones iniciales se escriben desde las secciones 4 a 7.</w:t>
+              <w:t>Aprobado por el equipo el 14 de septiembre de 2026. Los trece ajustes de la sección 3 quedaron aceptados y la sección 6 del Pilar 2 remite a este anexo en lugar de repetir los atributos. La versión 1.3 precisa cuándo nace la fila de usuario_ref, que la versión anterior ataba a declarar un perfil de tutor y dejaba sin fila a quien solo solicita tutorías. La versión 1.4 corrige la sección 12: Identidad no valida la carrera ni la sede contra Catálogo, se validan donde se usan (AD-15 del Pilar 2). Dice además que carrera, nivel y sede quedan en nulo hasta que el usuario completa su perfil, y que los diagramas están escritos pero todavía no en el repositorio. El código de los cinco diagramas se pone al día con sus archivos .mmd: el documento mostraba una versión anterior, sin la relación de quién cancela una reserva ni la columna activo de usuario_ref en la vista global, y con cardinalidades obligatorias donde el modelo admite que falte el dato: la carrera y la sede del usuario, su fila en usuario_ref y la copia de cada asignatura. Este documento es la fuente del esquema: las migraciones iniciales se escriben desde las secciones 4 a 7.</w:t>
             </w:r>
           </w:p>
         </w:tc>
@@ -2394,7 +2394,7 @@
           <w:sz w:val="14"/>
           <w:szCs w:val="14"/>
         </w:rPr>
-        <w:t xml:space="preserve">        uuid id PK "gen_random_uuid"</w:t>
+        <w:t xml:space="preserve">        uuid id PK "gen_random_uuid · viaja como sub del JWT"</w:t>
       </w:r>
     </w:p>
     <w:p>
@@ -2407,7 +2407,7 @@
           <w:sz w:val="14"/>
           <w:szCs w:val="14"/>
         </w:rPr>
-        <w:t xml:space="preserve">        varchar email UK "150 · único por lower email · CHECK dominio duocuc.cl"</w:t>
+        <w:t xml:space="preserve">        varchar email UK "150 · único por lower(email) · CHECK dominio duocuc.cl"</w:t>
       </w:r>
     </w:p>
     <w:p>
@@ -2420,7 +2420,7 @@
           <w:sz w:val="14"/>
           <w:szCs w:val="14"/>
         </w:rPr>
-        <w:t xml:space="preserve">        varchar password_hash "128 · Argon2 o PBKDF2"</w:t>
+        <w:t xml:space="preserve">        varchar password_hash "128 · Argon2 o PBKDF2 · nunca sale del servicio"</w:t>
       </w:r>
     </w:p>
     <w:p>
@@ -2433,7 +2433,7 @@
           <w:sz w:val="14"/>
           <w:szCs w:val="14"/>
         </w:rPr>
-        <w:t xml:space="preserve">        varchar nombre "80 · NOT NULL"</w:t>
+        <w:t xml:space="preserve">        varchar nombre "80 · se copia a tutoring_db.usuario_ref"</w:t>
       </w:r>
     </w:p>
     <w:p>
@@ -2446,7 +2446,7 @@
           <w:sz w:val="14"/>
           <w:szCs w:val="14"/>
         </w:rPr>
-        <w:t xml:space="preserve">        varchar apellido "80 · NOT NULL"</w:t>
+        <w:t xml:space="preserve">        varchar apellido "80 · se copia a tutoring_db.usuario_ref"</w:t>
       </w:r>
     </w:p>
     <w:p>
@@ -2459,7 +2459,7 @@
           <w:sz w:val="14"/>
           <w:szCs w:val="14"/>
         </w:rPr>
-        <w:t xml:space="preserve">        uuid carrera_id "NULL · ref. lógica a catalog_db.carrera"</w:t>
+        <w:t xml:space="preserve">        uuid carrera_id "NULL · referencia lógica a catalog_db.carrera"</w:t>
       </w:r>
     </w:p>
     <w:p>
@@ -2472,7 +2472,7 @@
           <w:sz w:val="14"/>
           <w:szCs w:val="14"/>
         </w:rPr>
-        <w:t xml:space="preserve">        smallint nivel "NULL · CHECK entre 1 y 12 · semestre que cursa"</w:t>
+        <w:t xml:space="preserve">        smallint nivel "NULL · CHECK 1 a 12 · no se copia (A-11) · el programador lo lee para revalidar RN-01 (A-13)"</w:t>
       </w:r>
     </w:p>
     <w:p>
@@ -2485,7 +2485,7 @@
           <w:sz w:val="14"/>
           <w:szCs w:val="14"/>
         </w:rPr>
-        <w:t xml:space="preserve">        uuid sede_id "NULL · ref. lógica a catalog_db.sede"</w:t>
+        <w:t xml:space="preserve">        uuid sede_id "NULL · referencia lógica a catalog_db.sede (A-07)"</w:t>
       </w:r>
     </w:p>
     <w:p>
@@ -2498,7 +2498,7 @@
           <w:sz w:val="14"/>
           <w:szCs w:val="14"/>
         </w:rPr>
-        <w:t xml:space="preserve">        boolean email_verificado "DEFAULT false · RN-08"</w:t>
+        <w:t xml:space="preserve">        boolean email_verificado "DEFAULT false · sin verificar no inicia sesión · RN-08"</w:t>
       </w:r>
     </w:p>
     <w:p>
@@ -2511,7 +2511,7 @@
           <w:sz w:val="14"/>
           <w:szCs w:val="14"/>
         </w:rPr>
-        <w:t xml:space="preserve">        boolean activo "DEFAULT true · RN-08"</w:t>
+        <w:t xml:space="preserve">        boolean activo "DEFAULT true · desactivar revoca los refresh_token · CA7"</w:t>
       </w:r>
     </w:p>
     <w:p>
@@ -2524,7 +2524,7 @@
           <w:sz w:val="14"/>
           <w:szCs w:val="14"/>
         </w:rPr>
-        <w:t xml:space="preserve">        boolean es_admin "DEFAULT false · marca del token"</w:t>
+        <w:t xml:space="preserve">        boolean es_admin "DEFAULT false · único origen de la marca del token · AD-09"</w:t>
       </w:r>
     </w:p>
     <w:p>
@@ -2550,7 +2550,7 @@
           <w:sz w:val="14"/>
           <w:szCs w:val="14"/>
         </w:rPr>
-        <w:t xml:space="preserve">        timestamptz actualizado_en "DEFAULT now"</w:t>
+        <w:t xml:space="preserve">        timestamptz actualizado_en "DEFAULT now · detecta copias de lectura desfasadas"</w:t>
       </w:r>
     </w:p>
     <w:p>
@@ -2589,7 +2589,7 @@
           <w:sz w:val="14"/>
           <w:szCs w:val="14"/>
         </w:rPr>
-        <w:t xml:space="preserve">        bigserial id PK "no cruza fronteras"</w:t>
+        <w:t xml:space="preserve">        bigserial id PK "interna · no cruza fronteras"</w:t>
       </w:r>
     </w:p>
     <w:p>
@@ -2615,7 +2615,7 @@
           <w:sz w:val="14"/>
           <w:szCs w:val="14"/>
         </w:rPr>
-        <w:t xml:space="preserve">        varchar token_hash UK "64 · sha256 del token enviado por correo"</w:t>
+        <w:t xml:space="preserve">        varchar token_hash UK "64 · sha256 del token enviado por correo (A-12)"</w:t>
       </w:r>
     </w:p>
     <w:p>
@@ -2628,7 +2628,7 @@
           <w:sz w:val="14"/>
           <w:szCs w:val="14"/>
         </w:rPr>
-        <w:t xml:space="preserve">        timestamptz expira_en "creado_en más 24 horas"</w:t>
+        <w:t xml:space="preserve">        timestamptz expira_en "creado_en más 24 horas · CHECK posterior a creado_en"</w:t>
       </w:r>
     </w:p>
     <w:p>
@@ -2641,7 +2641,7 @@
           <w:sz w:val="14"/>
           <w:szCs w:val="14"/>
         </w:rPr>
-        <w:t xml:space="preserve">        timestamptz usado_en "NULL · un solo uso"</w:t>
+        <w:t xml:space="preserve">        timestamptz usado_en "NULL · un solo uso · CA1"</w:t>
       </w:r>
     </w:p>
     <w:p>
@@ -2693,7 +2693,7 @@
           <w:sz w:val="14"/>
           <w:szCs w:val="14"/>
         </w:rPr>
-        <w:t xml:space="preserve">        bigserial id PK "no cruza fronteras"</w:t>
+        <w:t xml:space="preserve">        bigserial id PK "interna · no cruza fronteras"</w:t>
       </w:r>
     </w:p>
     <w:p>
@@ -2719,7 +2719,7 @@
           <w:sz w:val="14"/>
           <w:szCs w:val="14"/>
         </w:rPr>
-        <w:t xml:space="preserve">        varchar token_hash UK "64 · nunca se guarda el token en claro"</w:t>
+        <w:t xml:space="preserve">        varchar token_hash UK "64 · nunca se guarda el token en claro · RNF-01"</w:t>
       </w:r>
     </w:p>
     <w:p>
@@ -2732,7 +2732,7 @@
           <w:sz w:val="14"/>
           <w:szCs w:val="14"/>
         </w:rPr>
-        <w:t xml:space="preserve">        timestamptz expira_en "creado_en más 7 días"</w:t>
+        <w:t xml:space="preserve">        timestamptz expira_en "creado_en más 7 días · CHECK posterior a creado_en"</w:t>
       </w:r>
     </w:p>
     <w:p>
@@ -2745,7 +2745,7 @@
           <w:sz w:val="14"/>
           <w:szCs w:val="14"/>
         </w:rPr>
-        <w:t xml:space="preserve">        timestamptz revocado_en "NULL · logout o desactivación de la cuenta"</w:t>
+        <w:t xml:space="preserve">        timestamptz revocado_en "NULL · logout, rotación o cuenta desactivada"</w:t>
       </w:r>
     </w:p>
     <w:p>
@@ -2797,7 +2797,7 @@
           <w:sz w:val="14"/>
           <w:szCs w:val="14"/>
         </w:rPr>
-        <w:t xml:space="preserve">        bigserial id PK "registro de lo enviado · RF-09"</w:t>
+        <w:t xml:space="preserve">        bigserial id PK "registro de lo enviado · RF-09 · nueva en A-08"</w:t>
       </w:r>
     </w:p>
     <w:p>
@@ -2810,7 +2810,7 @@
           <w:sz w:val="14"/>
           <w:szCs w:val="14"/>
         </w:rPr>
-        <w:t xml:space="preserve">        uuid usuario_id FK "ON DELETE CASCADE"</w:t>
+        <w:t xml:space="preserve">        uuid usuario_id FK "destinatario · ON DELETE CASCADE"</w:t>
       </w:r>
     </w:p>
     <w:p>
@@ -2823,7 +2823,7 @@
           <w:sz w:val="14"/>
           <w:szCs w:val="14"/>
         </w:rPr>
-        <w:t xml:space="preserve">        varchar plantilla "40 · CHECK sobre la lista de plantillas"</w:t>
+        <w:t xml:space="preserve">        varchar plantilla "40 · CHECK sobre las seis plantillas de la sección 8"</w:t>
       </w:r>
     </w:p>
     <w:p>
@@ -2849,7 +2849,7 @@
           <w:sz w:val="14"/>
           <w:szCs w:val="14"/>
         </w:rPr>
-        <w:t xml:space="preserve">        uuid referencia_id "NULL · reserva que originó el aviso"</w:t>
+        <w:t xml:space="preserve">        uuid referencia_id "NULL · reserva que originó el aviso · da idempotencia"</w:t>
       </w:r>
     </w:p>
     <w:p>
@@ -2875,7 +2875,7 @@
           <w:sz w:val="14"/>
           <w:szCs w:val="14"/>
         </w:rPr>
-        <w:t xml:space="preserve">        varchar error "300 · NULL"</w:t>
+        <w:t xml:space="preserve">        varchar error "300 · NULL · mensaje del servidor de correo"</w:t>
       </w:r>
     </w:p>
     <w:p>
@@ -4170,7 +4170,7 @@
                 <w:sz w:val="17"/>
                 <w:szCs w:val="17"/>
               </w:rPr>
-              <w:t xml:space="preserve">Semestre que cursa. CHECK entre 1 y 12. Insumo de RN-01; lo declara el propio usuario</w:t>
+              <w:t xml:space="preserve">Semestre que cursa. CHECK entre 1 y 12. Insumo de RN-01; lo declara el propio usuario. NULL hasta que complete su perfil</w:t>
             </w:r>
           </w:p>
         </w:tc>
@@ -4318,7 +4318,7 @@
                 <w:sz w:val="17"/>
                 <w:szCs w:val="17"/>
               </w:rPr>
-              <w:t xml:space="preserve">Referencia lógica a catalog_db.sede (ajuste A-07)</w:t>
+              <w:t xml:space="preserve">Referencia lógica a catalog_db.sede, sin FK (ajuste A-07). NULL hasta que el usuario complete su perfil</w:t>
             </w:r>
           </w:p>
         </w:tc>
@@ -9073,7 +9073,7 @@
           <w:sz w:val="14"/>
           <w:szCs w:val="14"/>
         </w:rPr>
-        <w:t xml:space="preserve">        varchar codigo UK "20 · código interno de la carrera"</w:t>
+        <w:t xml:space="preserve">        varchar codigo UK "20 · clave natural del CSV de carga"</w:t>
       </w:r>
     </w:p>
     <w:p>
@@ -9086,7 +9086,7 @@
           <w:sz w:val="14"/>
           <w:szCs w:val="14"/>
         </w:rPr>
-        <w:t xml:space="preserve">        varchar nombre "150"</w:t>
+        <w:t xml:space="preserve">        varchar nombre "150 · se copia a usuario_ref.carrera_nombre"</w:t>
       </w:r>
     </w:p>
     <w:p>
@@ -9099,7 +9099,7 @@
           <w:sz w:val="14"/>
           <w:szCs w:val="14"/>
         </w:rPr>
-        <w:t xml:space="preserve">        varchar escuela "120 · etiqueta · no se filtra en el MVP"</w:t>
+        <w:t xml:space="preserve">        varchar escuela "120 · etiqueta · ninguna consulta del MVP filtra por ella"</w:t>
       </w:r>
     </w:p>
     <w:p>
@@ -9112,7 +9112,7 @@
           <w:sz w:val="14"/>
           <w:szCs w:val="14"/>
         </w:rPr>
-        <w:t xml:space="preserve">        boolean activa "DEFAULT true"</w:t>
+        <w:t xml:space="preserve">        boolean activa "DEFAULT true · borrado lógico"</w:t>
       </w:r>
     </w:p>
     <w:p>
@@ -9164,7 +9164,7 @@
           <w:sz w:val="14"/>
           <w:szCs w:val="14"/>
         </w:rPr>
-        <w:t xml:space="preserve">        bigserial id PK</w:t>
+        <w:t xml:space="preserve">        bigserial id PK "interna · no cruza fronteras"</w:t>
       </w:r>
     </w:p>
     <w:p>
@@ -9190,7 +9190,7 @@
           <w:sz w:val="14"/>
           <w:szCs w:val="14"/>
         </w:rPr>
-        <w:t xml:space="preserve">        varchar version "20 · año del plan de estudios"</w:t>
+        <w:t xml:space="preserve">        varchar version "20 · año del plan de estudios · único por carrera"</w:t>
       </w:r>
     </w:p>
     <w:p>
@@ -9216,7 +9216,7 @@
           <w:sz w:val="14"/>
           <w:szCs w:val="14"/>
         </w:rPr>
-        <w:t xml:space="preserve">        date vigente_hasta "NULL significa malla vigente · única por carrera"</w:t>
+        <w:t xml:space="preserve">        date vigente_hasta "NULL significa malla vigente · una sola por carrera"</w:t>
       </w:r>
     </w:p>
     <w:p>
@@ -9268,7 +9268,7 @@
           <w:sz w:val="14"/>
           <w:szCs w:val="14"/>
         </w:rPr>
-        <w:t xml:space="preserve">        uuid id PK "cruza a tutoring_db"</w:t>
+        <w:t xml:space="preserve">        uuid id PK "cruza a tutoring_db.asignatura_ref"</w:t>
       </w:r>
     </w:p>
     <w:p>
@@ -9281,7 +9281,7 @@
           <w:sz w:val="14"/>
           <w:szCs w:val="14"/>
         </w:rPr>
-        <w:t xml:space="preserve">        varchar sigla UK "15 · transversal entre carreras"</w:t>
+        <w:t xml:space="preserve">        varchar sigla UK "15 · transversal entre carreras · clave natural del CSV"</w:t>
       </w:r>
     </w:p>
     <w:p>
@@ -9294,7 +9294,7 @@
           <w:sz w:val="14"/>
           <w:szCs w:val="14"/>
         </w:rPr>
-        <w:t xml:space="preserve">        varchar nombre "150 · índice trigram para la búsqueda"</w:t>
+        <w:t xml:space="preserve">        varchar nombre "150 · índice GIN trigram para la búsqueda · RNF-02"</w:t>
       </w:r>
     </w:p>
     <w:p>
@@ -9372,7 +9372,7 @@
           <w:sz w:val="14"/>
           <w:szCs w:val="14"/>
         </w:rPr>
-        <w:t xml:space="preserve">        bigserial id PK</w:t>
+        <w:t xml:space="preserve">        bigserial id PK "interna"</w:t>
       </w:r>
     </w:p>
     <w:p>
@@ -9398,7 +9398,7 @@
           <w:sz w:val="14"/>
           <w:szCs w:val="14"/>
         </w:rPr>
-        <w:t xml:space="preserve">        uuid asignatura_id FK "ON DELETE RESTRICT"</w:t>
+        <w:t xml:space="preserve">        uuid asignatura_id FK "ON DELETE RESTRICT · único junto a malla_id"</w:t>
       </w:r>
     </w:p>
     <w:p>
@@ -9411,7 +9411,7 @@
           <w:sz w:val="14"/>
           <w:szCs w:val="14"/>
         </w:rPr>
-        <w:t xml:space="preserve">        smallint semestre "CHECK entre 1 y 12 · sostiene la regla RN-01"</w:t>
+        <w:t xml:space="preserve">        smallint semestre "CHECK entre 1 y 12 · se compara con usuario.nivel en RN-01"</w:t>
       </w:r>
     </w:p>
     <w:p>
@@ -9450,7 +9450,7 @@
           <w:sz w:val="14"/>
           <w:szCs w:val="14"/>
         </w:rPr>
-        <w:t xml:space="preserve">        bigserial id PK "estructura preparada · sin uso en el MVP"</w:t>
+        <w:t xml:space="preserve">        bigserial id PK "estructura preparada · sin uso funcional en el MVP"</w:t>
       </w:r>
     </w:p>
     <w:p>
@@ -9476,7 +9476,7 @@
           <w:sz w:val="14"/>
           <w:szCs w:val="14"/>
         </w:rPr>
-        <w:t xml:space="preserve">        bigint requiere_id FK "ON DELETE CASCADE · CHECK distinto de la anterior"</w:t>
+        <w:t xml:space="preserve">        bigint requiere_id FK "ON DELETE CASCADE · CHECK distinto del anterior"</w:t>
       </w:r>
     </w:p>
     <w:p>
@@ -9515,7 +9515,7 @@
           <w:sz w:val="14"/>
           <w:szCs w:val="14"/>
         </w:rPr>
-        <w:t xml:space="preserve">        uuid id PK "cruza a identity_db y a tutoring_db"</w:t>
+        <w:t xml:space="preserve">        uuid id PK "cruza a identity_db y a tutoring_db · nueva en A-07"</w:t>
       </w:r>
     </w:p>
     <w:p>
@@ -9541,7 +9541,7 @@
           <w:sz w:val="14"/>
           <w:szCs w:val="14"/>
         </w:rPr>
-        <w:t xml:space="preserve">        varchar nombre "120"</w:t>
+        <w:t xml:space="preserve">        varchar nombre "120 · se copia a usuario_ref.sede_nombre"</w:t>
       </w:r>
     </w:p>
     <w:p>
@@ -9619,7 +9619,7 @@
           <w:sz w:val="14"/>
           <w:szCs w:val="14"/>
         </w:rPr>
-        <w:t xml:space="preserve">        varchar archivo "200"</w:t>
+        <w:t xml:space="preserve">        varchar archivo "200 · nombre del CSV procesado"</w:t>
       </w:r>
     </w:p>
     <w:p>
@@ -9697,7 +9697,7 @@
           <w:sz w:val="14"/>
           <w:szCs w:val="14"/>
         </w:rPr>
-        <w:t xml:space="preserve">        uuid ejecutada_por "NULL · ref. lógica al usuario administrador"</w:t>
+        <w:t xml:space="preserve">        uuid ejecutada_por "NULL · referencia lógica al usuario administrador"</w:t>
       </w:r>
     </w:p>
     <w:p>
@@ -17534,7 +17534,7 @@
           <w:sz w:val="14"/>
           <w:szCs w:val="14"/>
         </w:rPr>
-        <w:t xml:space="preserve">        uuid usuario_id PK "copia de lectura · ref. lógica a identity_db.usuario"</w:t>
+        <w:t xml:space="preserve">        uuid usuario_id PK "el id de identity_db es la PK · la fila nace al primer contacto con Tutorías"</w:t>
       </w:r>
     </w:p>
     <w:p>
@@ -17547,7 +17547,7 @@
           <w:sz w:val="14"/>
           <w:szCs w:val="14"/>
         </w:rPr>
-        <w:t xml:space="preserve">        varchar nombre "80"</w:t>
+        <w:t xml:space="preserve">        varchar nombre "80 · copia"</w:t>
       </w:r>
     </w:p>
     <w:p>
@@ -17560,7 +17560,7 @@
           <w:sz w:val="14"/>
           <w:szCs w:val="14"/>
         </w:rPr>
-        <w:t xml:space="preserve">        varchar apellido "80"</w:t>
+        <w:t xml:space="preserve">        varchar apellido "80 · copia"</w:t>
       </w:r>
     </w:p>
     <w:p>
@@ -17573,7 +17573,7 @@
           <w:sz w:val="14"/>
           <w:szCs w:val="14"/>
         </w:rPr>
-        <w:t xml:space="preserve">        uuid carrera_id "NULL"</w:t>
+        <w:t xml:space="preserve">        uuid carrera_id "NULL · copia"</w:t>
       </w:r>
     </w:p>
     <w:p>
@@ -17586,7 +17586,7 @@
           <w:sz w:val="14"/>
           <w:szCs w:val="14"/>
         </w:rPr>
-        <w:t xml:space="preserve">        varchar carrera_nombre "150 · NULL · lo entrega Catálogo"</w:t>
+        <w:t xml:space="preserve">        varchar carrera_nombre "150 · NULL · lo entrega Catálogo, no Identidad"</w:t>
       </w:r>
     </w:p>
     <w:p>
@@ -17599,7 +17599,7 @@
           <w:sz w:val="14"/>
           <w:szCs w:val="14"/>
         </w:rPr>
-        <w:t xml:space="preserve">        uuid sede_id "NULL"</w:t>
+        <w:t xml:space="preserve">        uuid sede_id "NULL · copia"</w:t>
       </w:r>
     </w:p>
     <w:p>
@@ -17625,7 +17625,7 @@
           <w:sz w:val="14"/>
           <w:szCs w:val="14"/>
         </w:rPr>
-        <w:t xml:space="preserve">        boolean activo "DEFAULT true · RN-08 lo excluye de la búsqueda"</w:t>
+        <w:t xml:space="preserve">        boolean activo "DEFAULT true · sin esta columna RN-08 no se cumple (A-01) · hasta 5 min de desfase"</w:t>
       </w:r>
     </w:p>
     <w:p>
@@ -17651,7 +17651,7 @@
           <w:sz w:val="14"/>
           <w:szCs w:val="14"/>
         </w:rPr>
-        <w:t xml:space="preserve">        integer reputacion_total "DEFAULT 0 · evaluaciones visibles"</w:t>
+        <w:t xml:space="preserve">        integer reputacion_total "DEFAULT 0 · evaluaciones visibles · CHECK no negativa"</w:t>
       </w:r>
     </w:p>
     <w:p>
@@ -17664,7 +17664,7 @@
           <w:sz w:val="14"/>
           <w:szCs w:val="14"/>
         </w:rPr>
-        <w:t xml:space="preserve">        timestamptz actualizado_en "DEFAULT now · marca el desfase"</w:t>
+        <w:t xml:space="preserve">        timestamptz actualizado_en "DEFAULT now · mide el desfase que AD-07 acepta"</w:t>
       </w:r>
     </w:p>
     <w:p>
@@ -17703,7 +17703,7 @@
           <w:sz w:val="14"/>
           <w:szCs w:val="14"/>
         </w:rPr>
-        <w:t xml:space="preserve">        uuid asignatura_id PK "copia de lectura · ref. lógica a catalog_db.asignatura"</w:t>
+        <w:t xml:space="preserve">        uuid asignatura_id PK "copia de lectura de catalog_db.asignatura"</w:t>
       </w:r>
     </w:p>
     <w:p>
@@ -17716,7 +17716,7 @@
           <w:sz w:val="14"/>
           <w:szCs w:val="14"/>
         </w:rPr>
-        <w:t xml:space="preserve">        varchar sigla "15"</w:t>
+        <w:t xml:space="preserve">        varchar sigla "15 · copia"</w:t>
       </w:r>
     </w:p>
     <w:p>
@@ -17729,7 +17729,7 @@
           <w:sz w:val="14"/>
           <w:szCs w:val="14"/>
         </w:rPr>
-        <w:t xml:space="preserve">        varchar nombre "150"</w:t>
+        <w:t xml:space="preserve">        varchar nombre "150 · copia"</w:t>
       </w:r>
     </w:p>
     <w:p>
@@ -17781,7 +17781,7 @@
           <w:sz w:val="14"/>
           <w:szCs w:val="14"/>
         </w:rPr>
-        <w:t xml:space="preserve">        uuid id PK</w:t>
+        <w:t xml:space="preserve">        uuid id PK "se expone en PATCH /perfiles/{id}"</w:t>
       </w:r>
     </w:p>
     <w:p>
@@ -17807,7 +17807,7 @@
           <w:sz w:val="14"/>
           <w:szCs w:val="14"/>
         </w:rPr>
-        <w:t xml:space="preserve">        uuid asignatura_id FK "ON DELETE RESTRICT · validado con RN-01"</w:t>
+        <w:t xml:space="preserve">        uuid asignatura_id FK "ON DELETE RESTRICT · habilitación validada con RN-01"</w:t>
       </w:r>
     </w:p>
     <w:p>
@@ -17820,7 +17820,7 @@
           <w:sz w:val="14"/>
           <w:szCs w:val="14"/>
         </w:rPr>
-        <w:t xml:space="preserve">        numeric tarifa "8 enteros en pesos · DEFAULT 0 · CHECK no negativa"</w:t>
+        <w:t xml:space="preserve">        numeric tarifa "8 enteros en pesos · DEFAULT 0 · CHECK no negativa · RN-05"</w:t>
       </w:r>
     </w:p>
     <w:p>
@@ -17911,7 +17911,7 @@
           <w:sz w:val="14"/>
           <w:szCs w:val="14"/>
         </w:rPr>
-        <w:t xml:space="preserve">        uuid id PK</w:t>
+        <w:t xml:space="preserve">        uuid id PK "gen_random_uuid"</w:t>
       </w:r>
     </w:p>
     <w:p>
@@ -17937,7 +17937,7 @@
           <w:sz w:val="14"/>
           <w:szCs w:val="14"/>
         </w:rPr>
-        <w:t xml:space="preserve">        timestamptz inicio_en "UTC · solo fechas futuras al crear"</w:t>
+        <w:t xml:space="preserve">        timestamptz inicio_en "UTC · dos instantes en vez de fecha y horas (A-02) · solo futuro al crear"</w:t>
       </w:r>
     </w:p>
     <w:p>
@@ -17950,7 +17950,7 @@
           <w:sz w:val="14"/>
           <w:szCs w:val="14"/>
         </w:rPr>
-        <w:t xml:space="preserve">        timestamptz fin_en "CHECK posterior a inicio_en"</w:t>
+        <w:t xml:space="preserve">        timestamptz fin_en "CHECK posterior a inicio_en · EXCLUDE gist impide solapar · RN-02"</w:t>
       </w:r>
     </w:p>
     <w:p>
@@ -17963,7 +17963,7 @@
           <w:sz w:val="14"/>
           <w:szCs w:val="14"/>
         </w:rPr>
-        <w:t xml:space="preserve">        varchar estado "10 · LIBRE u OCUPADO"</w:t>
+        <w:t xml:space="preserve">        varchar estado "10 · LIBRE u OCUPADO · pasa a OCUPADO al confirmar"</w:t>
       </w:r>
     </w:p>
     <w:p>
@@ -18028,7 +18028,7 @@
           <w:sz w:val="14"/>
           <w:szCs w:val="14"/>
         </w:rPr>
-        <w:t xml:space="preserve">        uuid id PK "cruza a payment_db"</w:t>
+        <w:t xml:space="preserve">        uuid id PK "cruza a payment_db.pago.reserva_id"</w:t>
       </w:r>
     </w:p>
     <w:p>
@@ -18041,7 +18041,7 @@
           <w:sz w:val="14"/>
           <w:szCs w:val="14"/>
         </w:rPr>
-        <w:t xml:space="preserve">        uuid bloque_id FK "ON DELETE RESTRICT"</w:t>
+        <w:t xml:space="preserve">        uuid bloque_id FK "ON DELETE RESTRICT · único parcial por estado ocupado (A-03)"</w:t>
       </w:r>
     </w:p>
     <w:p>
@@ -18093,7 +18093,7 @@
           <w:sz w:val="14"/>
           <w:szCs w:val="14"/>
         </w:rPr>
-        <w:t xml:space="preserve">        varchar estado "12 · siete valores de la máquina de estados"</w:t>
+        <w:t xml:space="preserve">        varchar estado "12 · DEFAULT SOLICITADA · siete valores · ver sección 9"</w:t>
       </w:r>
     </w:p>
     <w:p>
@@ -18119,7 +18119,7 @@
           <w:sz w:val="14"/>
           <w:szCs w:val="14"/>
         </w:rPr>
-        <w:t xml:space="preserve">        varchar modalidad "12 · NULL · PRESENCIAL o EN_LINEA · RN-07"</w:t>
+        <w:t xml:space="preserve">        varchar modalidad "12 · NULL · PRESENCIAL o EN_LINEA · obligatoria al confirmar · RN-07"</w:t>
       </w:r>
     </w:p>
     <w:p>
@@ -18132,7 +18132,7 @@
           <w:sz w:val="14"/>
           <w:szCs w:val="14"/>
         </w:rPr>
-        <w:t xml:space="preserve">        varchar lugar_o_enlace "300 · NULL · lo indica el tutor al confirmar"</w:t>
+        <w:t xml:space="preserve">        varchar lugar_o_enlace "300 · NULL · lo indica el tutor al confirmar · RN-07"</w:t>
       </w:r>
     </w:p>
     <w:p>
@@ -18145,7 +18145,7 @@
           <w:sz w:val="14"/>
           <w:szCs w:val="14"/>
         </w:rPr>
-        <w:t xml:space="preserve">        numeric monto "8 enteros · copia de la tarifa al solicitar"</w:t>
+        <w:t xml:space="preserve">        numeric monto "8 enteros · copia congelada de la tarifa al solicitar (A-04)"</w:t>
       </w:r>
     </w:p>
     <w:p>
@@ -18158,7 +18158,7 @@
           <w:sz w:val="14"/>
           <w:szCs w:val="14"/>
         </w:rPr>
-        <w:t xml:space="preserve">        varchar estado_pago "12 · NULL · copia de lectura de Pagos"</w:t>
+        <w:t xml:space="preserve">        varchar estado_pago "12 · NULL · copia de lectura de Pagos · NULL si monto es 0"</w:t>
       </w:r>
     </w:p>
     <w:p>
@@ -18171,7 +18171,7 @@
           <w:sz w:val="14"/>
           <w:szCs w:val="14"/>
         </w:rPr>
-        <w:t xml:space="preserve">        timestamptz pago_actualizado_en "NULL · descarta avisos fuera de orden"</w:t>
+        <w:t xml:space="preserve">        timestamptz pago_actualizado_en "NULL · descarta avisos fuera de orden (A-06)"</w:t>
       </w:r>
     </w:p>
     <w:p>
@@ -18184,7 +18184,7 @@
           <w:sz w:val="14"/>
           <w:szCs w:val="14"/>
         </w:rPr>
-        <w:t xml:space="preserve">        uuid cancelada_por_usuario_id FK "NULL · RN-04 · quién canceló"</w:t>
+        <w:t xml:space="preserve">        uuid cancelada_por_usuario_id FK "NULL · quién canceló · RN-04 (A-05)"</w:t>
       </w:r>
     </w:p>
     <w:p>
@@ -18262,7 +18262,7 @@
           <w:sz w:val="14"/>
           <w:szCs w:val="14"/>
         </w:rPr>
-        <w:t xml:space="preserve">        uuid id PK</w:t>
+        <w:t xml:space="preserve">        uuid id PK "se expone en DELETE /admin/evaluaciones/{id}"</w:t>
       </w:r>
     </w:p>
     <w:p>
@@ -18275,7 +18275,7 @@
           <w:sz w:val="14"/>
           <w:szCs w:val="14"/>
         </w:rPr>
-        <w:t xml:space="preserve">        uuid reserva_id FK "UK · una sola evaluación por reserva · RN-06"</w:t>
+        <w:t xml:space="preserve">        uuid reserva_id FK,UK "ON DELETE CASCADE · una sola por reserva · RN-06"</w:t>
       </w:r>
     </w:p>
     <w:p>
@@ -18288,7 +18288,7 @@
           <w:sz w:val="14"/>
           <w:szCs w:val="14"/>
         </w:rPr>
-        <w:t xml:space="preserve">        smallint calificacion "CHECK entre 1 y 5"</w:t>
+        <w:t xml:space="preserve">        smallint calificacion "CHECK entre 1 y 5 · RN-06"</w:t>
       </w:r>
     </w:p>
     <w:p>
@@ -18314,7 +18314,7 @@
           <w:sz w:val="14"/>
           <w:szCs w:val="14"/>
         </w:rPr>
-        <w:t xml:space="preserve">        timestamptz retirada_en "NULL · retirada deja de contar · CA7"</w:t>
+        <w:t xml:space="preserve">        timestamptz retirada_en "NULL · retirada deja de contar en la reputación · CA7"</w:t>
       </w:r>
     </w:p>
     <w:p>
@@ -18327,7 +18327,7 @@
           <w:sz w:val="14"/>
           <w:szCs w:val="14"/>
         </w:rPr>
-        <w:t xml:space="preserve">        uuid retirada_por_usuario_id "NULL · administrador que la retiró"</w:t>
+        <w:t xml:space="preserve">        uuid retirada_por_usuario_id "NULL · referencia lógica al administrador"</w:t>
       </w:r>
     </w:p>
     <w:p>
@@ -18379,7 +18379,7 @@
           <w:sz w:val="14"/>
           <w:szCs w:val="14"/>
         </w:rPr>
-        <w:t xml:space="preserve">        bigserial id PK "evidencia del programador · AD-10"</w:t>
+        <w:t xml:space="preserve">        bigserial id PK "evidencia del programador · AD-10 · nueva en A-09"</w:t>
       </w:r>
     </w:p>
     <w:p>
@@ -18392,7 +18392,7 @@
           <w:sz w:val="14"/>
           <w:szCs w:val="14"/>
         </w:rPr>
-        <w:t xml:space="preserve">        varchar comando "40"</w:t>
+        <w:t xml:space="preserve">        varchar comando "40 · nombre del comando de Django ejecutado"</w:t>
       </w:r>
     </w:p>
     <w:p>
@@ -18405,7 +18405,7 @@
           <w:sz w:val="14"/>
           <w:szCs w:val="14"/>
         </w:rPr>
-        <w:t xml:space="preserve">        integer solicitudes_expiradas "DEFAULT 0"</w:t>
+        <w:t xml:space="preserve">        integer solicitudes_expiradas "DEFAULT 0 · RN-03"</w:t>
       </w:r>
     </w:p>
     <w:p>
@@ -18418,7 +18418,7 @@
           <w:sz w:val="14"/>
           <w:szCs w:val="14"/>
         </w:rPr>
-        <w:t xml:space="preserve">        integer reservas_cerradas "DEFAULT 0"</w:t>
+        <w:t xml:space="preserve">        integer reservas_cerradas "DEFAULT 0 · paso a REALIZADA"</w:t>
       </w:r>
     </w:p>
     <w:p>
@@ -18431,7 +18431,7 @@
           <w:sz w:val="14"/>
           <w:szCs w:val="14"/>
         </w:rPr>
-        <w:t xml:space="preserve">        integer refs_sincronizadas "DEFAULT 0"</w:t>
+        <w:t xml:space="preserve">        integer refs_sincronizadas "DEFAULT 0 · copias de lectura refrescadas (A-01)"</w:t>
       </w:r>
     </w:p>
     <w:p>
@@ -18444,7 +18444,7 @@
           <w:sz w:val="14"/>
           <w:szCs w:val="14"/>
         </w:rPr>
-        <w:t>integer perfiles_desactivados "DEFAULT 0 · revalidación de RN-01 · A-13"</w:t>
+        <w:t xml:space="preserve">        integer perfiles_desactivados "DEFAULT 0 · revalidación de RN-01 al cambiar carrera o nivel (A-13)"</w:t>
       </w:r>
     </w:p>
     <w:p>
@@ -18483,7 +18483,7 @@
           <w:sz w:val="14"/>
           <w:szCs w:val="14"/>
         </w:rPr>
-        <w:t xml:space="preserve">        timestamptz terminada_en "NULL"</w:t>
+        <w:t xml:space="preserve">        timestamptz terminada_en "NULL indica una ejecución interrumpida"</w:t>
       </w:r>
     </w:p>
     <w:p>
@@ -18575,6 +18575,19 @@
           <w:szCs w:val="14"/>
         </w:rPr>
         <w:t xml:space="preserve">    usuario_ref ||--o{ reserva : "solicita como estudiante"</w:t>
+      </w:r>
+    </w:p>
+    <w:p>
+      <w:pPr>
+        <w:spacing w:after="0"/>
+      </w:pPr>
+      <w:r>
+        <w:rPr>
+          <w:rFonts w:ascii="Consolas" w:cs="Consolas" w:eastAsia="Consolas" w:hAnsi="Consolas"/>
+          <w:sz w:val="14"/>
+          <w:szCs w:val="14"/>
+        </w:rPr>
+        <w:t xml:space="preserve">    usuario_ref |o--o{ reserva : "canceló · RN-04"</w:t>
       </w:r>
     </w:p>
     <w:p>
@@ -29918,7 +29931,7 @@
           <w:sz w:val="14"/>
           <w:szCs w:val="14"/>
         </w:rPr>
-        <w:t xml:space="preserve">        uuid id PK</w:t>
+        <w:t xml:space="preserve">        uuid id PK "gen_random_uuid"</w:t>
       </w:r>
     </w:p>
     <w:p>
@@ -29931,7 +29944,7 @@
           <w:sz w:val="14"/>
           <w:szCs w:val="14"/>
         </w:rPr>
-        <w:t xml:space="preserve">        uuid reserva_id UK "ref. lógica a tutoring_db.reserva · un pago por reserva"</w:t>
+        <w:t xml:space="preserve">        uuid reserva_id UK "referencia lógica a tutoring_db.reserva · un pago por reserva"</w:t>
       </w:r>
     </w:p>
     <w:p>
@@ -29944,7 +29957,7 @@
           <w:sz w:val="14"/>
           <w:szCs w:val="14"/>
         </w:rPr>
-        <w:t xml:space="preserve">        numeric monto "8 enteros en pesos · CHECK mayor que cero"</w:t>
+        <w:t xml:space="preserve">        numeric monto "8 enteros en pesos · CHECK mayor que cero · sin tarifa no hay pago"</w:t>
       </w:r>
     </w:p>
     <w:p>
@@ -29957,7 +29970,7 @@
           <w:sz w:val="14"/>
           <w:szCs w:val="14"/>
         </w:rPr>
-        <w:t xml:space="preserve">        varchar estado "12 · PENDIENTE, PAGADO, FALLIDO o REEMBOLSADO"</w:t>
+        <w:t xml:space="preserve">        varchar estado "12 · DEFAULT PENDIENTE · PAGADO, FALLIDO o REEMBOLSADO · RN-05"</w:t>
       </w:r>
     </w:p>
     <w:p>
@@ -29970,7 +29983,7 @@
           <w:sz w:val="14"/>
           <w:szCs w:val="14"/>
         </w:rPr>
-        <w:t xml:space="preserve">        varchar proveedor "30 · DEFAULT SIMULADO · punto de integración real"</w:t>
+        <w:t xml:space="preserve">        varchar proveedor "30 · DEFAULT SIMULADO · punto de integración real · RF-18"</w:t>
       </w:r>
     </w:p>
     <w:p>
@@ -29996,7 +30009,7 @@
           <w:sz w:val="14"/>
           <w:szCs w:val="14"/>
         </w:rPr>
-        <w:t xml:space="preserve">        timestamptz notificado_en "NULL · aviso a Tutorías ya confirmado"</w:t>
+        <w:t xml:space="preserve">        timestamptz notificado_en "NULL · Tutorías ya confirmó el aviso · permite reintentar"</w:t>
       </w:r>
     </w:p>
     <w:p>
@@ -30061,7 +30074,7 @@
           <w:sz w:val="14"/>
           <w:szCs w:val="14"/>
         </w:rPr>
-        <w:t xml:space="preserve">        bigserial id PK "historial de reintentos · RN-05"</w:t>
+        <w:t xml:space="preserve">        bigserial id PK "historial de reintentos · RN-05 y CA9 · nueva en A-10"</w:t>
       </w:r>
     </w:p>
     <w:p>
@@ -30087,7 +30100,7 @@
           <w:sz w:val="14"/>
           <w:szCs w:val="14"/>
         </w:rPr>
-        <w:t xml:space="preserve">        varchar tipo "10 · COBRO o REEMBOLSO"</w:t>
+        <w:t xml:space="preserve">        varchar tipo "10 · DEFAULT COBRO · COBRO o REEMBOLSO"</w:t>
       </w:r>
     </w:p>
     <w:p>
@@ -36798,7 +36811,7 @@
           <w:sz w:val="14"/>
           <w:szCs w:val="14"/>
         </w:rPr>
-        <w:t xml:space="preserve">        varchar email UK "solo existe aquí"</w:t>
+        <w:t xml:space="preserve">        varchar email UK "solo existe aquí · RNF-07"</w:t>
       </w:r>
     </w:p>
     <w:p>
@@ -36837,7 +36850,7 @@
           <w:sz w:val="14"/>
           <w:szCs w:val="14"/>
         </w:rPr>
-        <w:t xml:space="preserve">        smallint nivel "insumo de RN-01"</w:t>
+        <w:t xml:space="preserve">        smallint nivel "insumo de RN-01 · no se copia · el programador lo lee (A-13)"</w:t>
       </w:r>
     </w:p>
     <w:p>
@@ -36889,7 +36902,7 @@
           <w:sz w:val="14"/>
           <w:szCs w:val="14"/>
         </w:rPr>
-        <w:t xml:space="preserve">        bigserial id PK "único emisor de correos"</w:t>
+        <w:t xml:space="preserve">        bigserial id PK "único emisor de correos del sistema · AD-11"</w:t>
       </w:r>
     </w:p>
     <w:p>
@@ -36941,7 +36954,7 @@
           <w:sz w:val="14"/>
           <w:szCs w:val="14"/>
         </w:rPr>
-        <w:t xml:space="preserve">        uuid id PK "datos de referencia"</w:t>
+        <w:t xml:space="preserve">        uuid id PK "dato de referencia"</w:t>
       </w:r>
     </w:p>
     <w:p>
@@ -36993,7 +37006,7 @@
           <w:sz w:val="14"/>
           <w:szCs w:val="14"/>
         </w:rPr>
-        <w:t xml:space="preserve">        uuid id PK "datos de referencia"</w:t>
+        <w:t xml:space="preserve">        uuid id PK "dato de referencia"</w:t>
       </w:r>
     </w:p>
     <w:p>
@@ -37045,7 +37058,7 @@
           <w:sz w:val="14"/>
           <w:szCs w:val="14"/>
         </w:rPr>
-        <w:t xml:space="preserve">        bigserial id PK "versión del plan"</w:t>
+        <w:t xml:space="preserve">        bigserial id PK "versión del plan de estudios"</w:t>
       </w:r>
     </w:p>
     <w:p>
@@ -37136,7 +37149,7 @@
           <w:sz w:val="14"/>
           <w:szCs w:val="14"/>
         </w:rPr>
-        <w:t xml:space="preserve">        bigserial id PK</w:t>
+        <w:t xml:space="preserve">        bigserial id PK "ubica la asignatura en un semestre"</w:t>
       </w:r>
     </w:p>
     <w:p>
@@ -37227,7 +37240,7 @@
           <w:sz w:val="14"/>
           <w:szCs w:val="14"/>
         </w:rPr>
-        <w:t xml:space="preserve">        numeric reputacion_promedio "dato propio de Tutorías"</w:t>
+        <w:t xml:space="preserve">        boolean activo "sincronizado por el programador · A-01 · hasta 5 min de desfase"</w:t>
       </w:r>
     </w:p>
     <w:p>
@@ -37240,7 +37253,7 @@
           <w:sz w:val="14"/>
           <w:szCs w:val="14"/>
         </w:rPr>
-        <w:t xml:space="preserve">    }</w:t>
+        <w:t xml:space="preserve">        numeric reputacion_promedio "dato propio de Tutorías"</w:t>
       </w:r>
     </w:p>
     <w:p>
@@ -37253,7 +37266,7 @@
           <w:sz w:val="14"/>
           <w:szCs w:val="14"/>
         </w:rPr>
-        <w:t xml:space="preserve">    tutorias_asignatura_ref {</w:t>
+        <w:t xml:space="preserve">    }</w:t>
       </w:r>
     </w:p>
     <w:p>
@@ -37266,7 +37279,7 @@
           <w:sz w:val="14"/>
           <w:szCs w:val="14"/>
         </w:rPr>
-        <w:t xml:space="preserve">        uuid asignatura_id PK "copia de lectura"</w:t>
+        <w:t xml:space="preserve">    tutorias_asignatura_ref {</w:t>
       </w:r>
     </w:p>
     <w:p>
@@ -37279,7 +37292,7 @@
           <w:sz w:val="14"/>
           <w:szCs w:val="14"/>
         </w:rPr>
-        <w:t xml:space="preserve">        varchar sigla "15"</w:t>
+        <w:t xml:space="preserve">        uuid asignatura_id PK "copia de lectura"</w:t>
       </w:r>
     </w:p>
     <w:p>
@@ -37292,7 +37305,7 @@
           <w:sz w:val="14"/>
           <w:szCs w:val="14"/>
         </w:rPr>
-        <w:t xml:space="preserve">    }</w:t>
+        <w:t xml:space="preserve">        varchar sigla "15"</w:t>
       </w:r>
     </w:p>
     <w:p>
@@ -37305,7 +37318,7 @@
           <w:sz w:val="14"/>
           <w:szCs w:val="14"/>
         </w:rPr>
-        <w:t xml:space="preserve">    tutorias_perfil_tutor {</w:t>
+        <w:t xml:space="preserve">    }</w:t>
       </w:r>
     </w:p>
     <w:p>
@@ -37318,7 +37331,7 @@
           <w:sz w:val="14"/>
           <w:szCs w:val="14"/>
         </w:rPr>
-        <w:t xml:space="preserve">        uuid id PK</w:t>
+        <w:t xml:space="preserve">    tutorias_perfil_tutor {</w:t>
       </w:r>
     </w:p>
     <w:p>
@@ -37331,7 +37344,7 @@
           <w:sz w:val="14"/>
           <w:szCs w:val="14"/>
         </w:rPr>
-        <w:t xml:space="preserve">        numeric tarifa "la fija el tutor · RN-05"</w:t>
+        <w:t xml:space="preserve">        uuid id PK "una fila por asignatura declarada"</w:t>
       </w:r>
     </w:p>
     <w:p>
@@ -37344,7 +37357,7 @@
           <w:sz w:val="14"/>
           <w:szCs w:val="14"/>
         </w:rPr>
-        <w:t xml:space="preserve">    }</w:t>
+        <w:t xml:space="preserve">        numeric tarifa "la fija el tutor · puede ser 0 · RN-05"</w:t>
       </w:r>
     </w:p>
     <w:p>
@@ -37357,7 +37370,7 @@
           <w:sz w:val="14"/>
           <w:szCs w:val="14"/>
         </w:rPr>
-        <w:t xml:space="preserve">    tutorias_bloque_disponibilidad {</w:t>
+        <w:t xml:space="preserve">    }</w:t>
       </w:r>
     </w:p>
     <w:p>
@@ -37370,7 +37383,7 @@
           <w:sz w:val="14"/>
           <w:szCs w:val="14"/>
         </w:rPr>
-        <w:t xml:space="preserve">        uuid id PK</w:t>
+        <w:t xml:space="preserve">    tutorias_bloque_disponibilidad {</w:t>
       </w:r>
     </w:p>
     <w:p>
@@ -37383,7 +37396,7 @@
           <w:sz w:val="14"/>
           <w:szCs w:val="14"/>
         </w:rPr>
-        <w:t xml:space="preserve">        varchar estado "LIBRE u OCUPADO"</w:t>
+        <w:t xml:space="preserve">        uuid id PK "dos instantes en UTC"</w:t>
       </w:r>
     </w:p>
     <w:p>
@@ -37396,7 +37409,7 @@
           <w:sz w:val="14"/>
           <w:szCs w:val="14"/>
         </w:rPr>
-        <w:t xml:space="preserve">    }</w:t>
+        <w:t xml:space="preserve">        varchar estado "LIBRE u OCUPADO"</w:t>
       </w:r>
     </w:p>
     <w:p>
@@ -37409,7 +37422,7 @@
           <w:sz w:val="14"/>
           <w:szCs w:val="14"/>
         </w:rPr>
-        <w:t xml:space="preserve">    tutorias_reserva {</w:t>
+        <w:t xml:space="preserve">    }</w:t>
       </w:r>
     </w:p>
     <w:p>
@@ -37422,7 +37435,7 @@
           <w:sz w:val="14"/>
           <w:szCs w:val="14"/>
         </w:rPr>
-        <w:t xml:space="preserve">        uuid id PK "cruza a Pagos"</w:t>
+        <w:t xml:space="preserve">    tutorias_reserva {</w:t>
       </w:r>
     </w:p>
     <w:p>
@@ -37435,7 +37448,7 @@
           <w:sz w:val="14"/>
           <w:szCs w:val="14"/>
         </w:rPr>
-        <w:t xml:space="preserve">        varchar estado "máquina de estados"</w:t>
+        <w:t xml:space="preserve">        uuid id PK "cruza a Pagos"</w:t>
       </w:r>
     </w:p>
     <w:p>
@@ -37448,7 +37461,7 @@
           <w:sz w:val="14"/>
           <w:szCs w:val="14"/>
         </w:rPr>
-        <w:t xml:space="preserve">        varchar estado_pago "copia de lectura · puede ser NULL"</w:t>
+        <w:t xml:space="preserve">        varchar estado "máquina de estados de siete valores"</w:t>
       </w:r>
     </w:p>
     <w:p>
@@ -37461,7 +37474,7 @@
           <w:sz w:val="14"/>
           <w:szCs w:val="14"/>
         </w:rPr>
-        <w:t xml:space="preserve">    }</w:t>
+        <w:t xml:space="preserve">        varchar estado_pago "copia de lectura · puede ser NULL"</w:t>
       </w:r>
     </w:p>
     <w:p>
@@ -37474,7 +37487,7 @@
           <w:sz w:val="14"/>
           <w:szCs w:val="14"/>
         </w:rPr>
-        <w:t xml:space="preserve">    tutorias_evaluacion {</w:t>
+        <w:t xml:space="preserve">    }</w:t>
       </w:r>
     </w:p>
     <w:p>
@@ -37487,7 +37500,7 @@
           <w:sz w:val="14"/>
           <w:szCs w:val="14"/>
         </w:rPr>
-        <w:t xml:space="preserve">        uuid id PK</w:t>
+        <w:t xml:space="preserve">    tutorias_evaluacion {</w:t>
       </w:r>
     </w:p>
     <w:p>
@@ -37500,7 +37513,7 @@
           <w:sz w:val="14"/>
           <w:szCs w:val="14"/>
         </w:rPr>
-        <w:t xml:space="preserve">        smallint calificacion "1 a 5"</w:t>
+        <w:t xml:space="preserve">        uuid id PK "una por reserva"</w:t>
       </w:r>
     </w:p>
     <w:p>
@@ -37513,7 +37526,7 @@
           <w:sz w:val="14"/>
           <w:szCs w:val="14"/>
         </w:rPr>
-        <w:t xml:space="preserve">    }</w:t>
+        <w:t xml:space="preserve">        smallint calificacion "1 a 5"</w:t>
       </w:r>
     </w:p>
     <w:p>
@@ -37526,7 +37539,7 @@
           <w:sz w:val="14"/>
           <w:szCs w:val="14"/>
         </w:rPr>
-        <w:t xml:space="preserve">    pagos_pago {</w:t>
+        <w:t xml:space="preserve">    }</w:t>
       </w:r>
     </w:p>
     <w:p>
@@ -37539,7 +37552,7 @@
           <w:sz w:val="14"/>
           <w:szCs w:val="14"/>
         </w:rPr>
-        <w:t xml:space="preserve">        uuid id PK</w:t>
+        <w:t xml:space="preserve">    pagos_pago {</w:t>
       </w:r>
     </w:p>
     <w:p>
@@ -37552,7 +37565,7 @@
           <w:sz w:val="14"/>
           <w:szCs w:val="14"/>
         </w:rPr>
-        <w:t xml:space="preserve">        uuid reserva_id UK "referencia lógica"</w:t>
+        <w:t xml:space="preserve">        uuid id PK "un pago por reserva"</w:t>
       </w:r>
     </w:p>
     <w:p>
@@ -37565,7 +37578,7 @@
           <w:sz w:val="14"/>
           <w:szCs w:val="14"/>
         </w:rPr>
-        <w:t xml:space="preserve">        varchar estado "fuente de verdad del pago"</w:t>
+        <w:t xml:space="preserve">        uuid reserva_id UK "referencia lógica"</w:t>
       </w:r>
     </w:p>
     <w:p>
@@ -37578,7 +37591,7 @@
           <w:sz w:val="14"/>
           <w:szCs w:val="14"/>
         </w:rPr>
-        <w:t xml:space="preserve">    }</w:t>
+        <w:t xml:space="preserve">        varchar estado "fuente de verdad del pago"</w:t>
       </w:r>
     </w:p>
     <w:p>
@@ -37591,7 +37604,7 @@
           <w:sz w:val="14"/>
           <w:szCs w:val="14"/>
         </w:rPr>
-        <w:t xml:space="preserve">    identidad_usuario ||--o{ identidad_aviso_correo : "FK real en identity_db"</w:t>
+        <w:t xml:space="preserve">    }</w:t>
       </w:r>
     </w:p>
     <w:p>
@@ -37604,7 +37617,7 @@
           <w:sz w:val="14"/>
           <w:szCs w:val="14"/>
         </w:rPr>
-        <w:t xml:space="preserve">    catalogo_carrera ||--o{ catalogo_malla : "FK real en catalog_db"</w:t>
+        <w:t xml:space="preserve">    identidad_usuario ||--o{ identidad_aviso_correo : "FK real en identity_db"</w:t>
       </w:r>
     </w:p>
     <w:p>
@@ -37617,7 +37630,7 @@
           <w:sz w:val="14"/>
           <w:szCs w:val="14"/>
         </w:rPr>
-        <w:t xml:space="preserve">    catalogo_malla ||--o{ catalogo_malla_asignatura : "FK real en catalog_db"</w:t>
+        <w:t xml:space="preserve">    catalogo_carrera ||--o{ catalogo_malla : "FK real en catalog_db"</w:t>
       </w:r>
     </w:p>
     <w:p>
@@ -37630,7 +37643,7 @@
           <w:sz w:val="14"/>
           <w:szCs w:val="14"/>
         </w:rPr>
-        <w:t xml:space="preserve">    catalogo_asignatura ||--o{ catalogo_malla_asignatura : "FK real en catalog_db"</w:t>
+        <w:t xml:space="preserve">    catalogo_malla ||--o{ catalogo_malla_asignatura : "FK real en catalog_db"</w:t>
       </w:r>
     </w:p>
     <w:p>
@@ -37643,7 +37656,7 @@
           <w:sz w:val="14"/>
           <w:szCs w:val="14"/>
         </w:rPr>
-        <w:t xml:space="preserve">    tutorias_usuario_ref ||--o{ tutorias_perfil_tutor : "FK real en tutoring_db"</w:t>
+        <w:t xml:space="preserve">    catalogo_asignatura ||--o{ catalogo_malla_asignatura : "FK real en catalog_db"</w:t>
       </w:r>
     </w:p>
     <w:p>
@@ -37656,7 +37669,7 @@
           <w:sz w:val="14"/>
           <w:szCs w:val="14"/>
         </w:rPr>
-        <w:t xml:space="preserve">    tutorias_asignatura_ref ||--o{ tutorias_perfil_tutor : "FK real en tutoring_db"</w:t>
+        <w:t xml:space="preserve">    tutorias_usuario_ref ||--o{ tutorias_perfil_tutor : "FK real en tutoring_db"</w:t>
       </w:r>
     </w:p>
     <w:p>
@@ -37669,7 +37682,7 @@
           <w:sz w:val="14"/>
           <w:szCs w:val="14"/>
         </w:rPr>
-        <w:t xml:space="preserve">    tutorias_usuario_ref ||--o{ tutorias_bloque_disponibilidad : "FK real en tutoring_db"</w:t>
+        <w:t xml:space="preserve">    tutorias_asignatura_ref ||--o{ tutorias_perfil_tutor : "FK real en tutoring_db"</w:t>
       </w:r>
     </w:p>
     <w:p>
@@ -37682,7 +37695,7 @@
           <w:sz w:val="14"/>
           <w:szCs w:val="14"/>
         </w:rPr>
-        <w:t xml:space="preserve">    tutorias_bloque_disponibilidad ||--o{ tutorias_reserva : "FK real en tutoring_db"</w:t>
+        <w:t xml:space="preserve">    tutorias_usuario_ref ||--o{ tutorias_bloque_disponibilidad : "FK real en tutoring_db"</w:t>
       </w:r>
     </w:p>
     <w:p>
@@ -37695,7 +37708,7 @@
           <w:sz w:val="14"/>
           <w:szCs w:val="14"/>
         </w:rPr>
-        <w:t xml:space="preserve">    tutorias_usuario_ref ||--o{ tutorias_reserva : "FK real · tutor y solicitante"</w:t>
+        <w:t xml:space="preserve">    tutorias_bloque_disponibilidad ||--o{ tutorias_reserva : "FK real en tutoring_db"</w:t>
       </w:r>
     </w:p>
     <w:p>
@@ -37708,7 +37721,7 @@
           <w:sz w:val="14"/>
           <w:szCs w:val="14"/>
         </w:rPr>
-        <w:t xml:space="preserve">    tutorias_reserva ||--o| tutorias_evaluacion : "FK real en tutoring_db"</w:t>
+        <w:t xml:space="preserve">    tutorias_usuario_ref ||--o{ tutorias_reserva : "FK real · tutor y solicitante"</w:t>
       </w:r>
     </w:p>
     <w:p>
@@ -37721,7 +37734,7 @@
           <w:sz w:val="14"/>
           <w:szCs w:val="14"/>
         </w:rPr>
-        <w:t xml:space="preserve">    identidad_usuario ||..|| tutorias_usuario_ref : "llamada 2 · copia nombre, sede y activo"</w:t>
+        <w:t xml:space="preserve">    tutorias_reserva ||--o| tutorias_evaluacion : "FK real en tutoring_db"</w:t>
       </w:r>
     </w:p>
     <w:p>
@@ -37734,7 +37747,7 @@
           <w:sz w:val="14"/>
           <w:szCs w:val="14"/>
         </w:rPr>
-        <w:t xml:space="preserve">    catalogo_carrera ||..o{ tutorias_usuario_ref : "llamada 1 · copia carrera_nombre"</w:t>
+        <w:t xml:space="preserve">    identidad_usuario ||..o| tutorias_usuario_ref : "llamada 2 · nace al primer contacto con Tutorías"</w:t>
       </w:r>
     </w:p>
     <w:p>
@@ -37747,7 +37760,7 @@
           <w:sz w:val="14"/>
           <w:szCs w:val="14"/>
         </w:rPr>
-        <w:t xml:space="preserve">    catalogo_sede ||..o{ tutorias_usuario_ref : "llamada 1 · copia sede_nombre"</w:t>
+        <w:t xml:space="preserve">    catalogo_carrera ||..o{ tutorias_usuario_ref : "llamada 1 · copia carrera_nombre"</w:t>
       </w:r>
     </w:p>
     <w:p>
@@ -37760,7 +37773,7 @@
           <w:sz w:val="14"/>
           <w:szCs w:val="14"/>
         </w:rPr>
-        <w:t xml:space="preserve">    catalogo_asignatura ||..|| tutorias_asignatura_ref : "llamada 1 · copia sigla y nombre"</w:t>
+        <w:t xml:space="preserve">    catalogo_sede ||..o{ tutorias_usuario_ref : "llamada 1 · copia sede_nombre"</w:t>
       </w:r>
     </w:p>
     <w:p>
@@ -37773,7 +37786,7 @@
           <w:sz w:val="14"/>
           <w:szCs w:val="14"/>
         </w:rPr>
-        <w:t xml:space="preserve">    catalogo_malla_asignatura }o..o{ tutorias_perfil_tutor : "llamada 1 · valida RN-01 al declarar"</w:t>
+        <w:t xml:space="preserve">    catalogo_asignatura ||..o| tutorias_asignatura_ref : "llamada 1 · copia sigla y nombre"</w:t>
       </w:r>
     </w:p>
     <w:p>
@@ -37786,7 +37799,7 @@
           <w:sz w:val="14"/>
           <w:szCs w:val="14"/>
         </w:rPr>
-        <w:t xml:space="preserve">    identidad_usuario }o..|| catalogo_carrera : "carrera_id · sin integridad referencial"</w:t>
+        <w:t xml:space="preserve">    catalogo_malla_asignatura }o..o{ tutorias_perfil_tutor : "llamada 1 · valida RN-01 al declarar"</w:t>
       </w:r>
     </w:p>
     <w:p>
@@ -37799,7 +37812,20 @@
           <w:sz w:val="14"/>
           <w:szCs w:val="14"/>
         </w:rPr>
-        <w:t xml:space="preserve">    identidad_usuario }o..|| catalogo_sede : "sede_id · sin integridad referencial"</w:t>
+        <w:t xml:space="preserve">    identidad_usuario }o..o| catalogo_carrera : "carrera_id · sin integridad referencial"</w:t>
+      </w:r>
+    </w:p>
+    <w:p>
+      <w:pPr>
+        <w:spacing w:after="0"/>
+      </w:pPr>
+      <w:r>
+        <w:rPr>
+          <w:rFonts w:ascii="Consolas" w:cs="Consolas" w:eastAsia="Consolas" w:hAnsi="Consolas"/>
+          <w:sz w:val="14"/>
+          <w:szCs w:val="14"/>
+        </w:rPr>
+        <w:t xml:space="preserve">    identidad_usuario }o..o| catalogo_sede : "sede_id · sin integridad referencial"</w:t>
       </w:r>
     </w:p>
     <w:p>
@@ -37958,7 +37984,7 @@
                 <w:sz w:val="17"/>
                 <w:szCs w:val="17"/>
               </w:rPr>
-              <w:t xml:space="preserve">Identidad guarda el identificador y no el nombre. Valida que exista al registrar; si Catálogo no responde, acepta el valor y la validación queda pendiente. No hay borrado en cascada posible: una carrera se desactiva, no se borra.</w:t>
+              <w:t xml:space="preserve">Identidad guarda el identificador y no el nombre, y no lo valida contra Catálogo (AD-15 del Pilar 2): el formulario de perfil solo ofrece valores de GET /carreras y GET /sedes, y la carrera se valida donde se usa, cuando Tutorías pide la malla para RN-01. Un identificador inventado por fuera de la interfaz queda guardado, pero no habilita ninguna asignatura ni muestra ninguna sede. No hay borrado en cascada posible: una carrera se desactiva, no se borra.</w:t>
             </w:r>
           </w:p>
         </w:tc>
@@ -38301,7 +38327,7 @@
           <w:sz w:val="20"/>
           <w:szCs w:val="20"/>
         </w:rPr>
-        <w:t xml:space="preserve">Guardar los cinco diagramas en docs/diagramas/ como archivos .mmd, para que se rendericen en el repositorio y se puedan versionar como texto.</w:t>
+        <w:t xml:space="preserve">Subir los cinco diagramas al repositorio: ya están escritos como archivos .mmd, con su .png, en docs/diagramas/ de la carpeta del proyecto, pero esa carpeta todavía no existe en el repositorio.</w:t>
       </w:r>
     </w:p>
     <w:sectPr>

</xml_diff>

<commit_message>
Docs · Fase 1, README completo y planificación al día (#3)
* docs(fase-1): crear las carpetas de evidencias grupales e individuales

* docs(readme): completar el README con los elementos que exige el instructivo

* docs(planificacion): actualizar los pilares y el anexo A, y subir los diagramas
</commit_message>
<xml_diff>
--- a/docs/planificacion/Pilar2_AnexoA_Modelo_de_Datos.docx
+++ b/docs/planificacion/Pilar2_AnexoA_Modelo_de_Datos.docx
@@ -214,7 +214,7 @@
                 <w:sz w:val="17"/>
                 <w:szCs w:val="17"/>
               </w:rPr>
-              <w:t>1.3</w:t>
+              <w:t>1.4</w:t>
             </w:r>
           </w:p>
         </w:tc>
@@ -262,7 +262,7 @@
                 <w:sz w:val="17"/>
                 <w:szCs w:val="17"/>
               </w:rPr>
-              <w:t>14 de septiembre de 2026</w:t>
+              <w:t>25 de septiembre de 2026</w:t>
             </w:r>
           </w:p>
         </w:tc>
@@ -312,7 +312,7 @@
                 <w:sz w:val="17"/>
                 <w:szCs w:val="17"/>
               </w:rPr>
-              <w:t>Pilar 2 — Diseño y Arquitectura, versión 1.3 (sección 6) · Pilar 1 — Alcance, versión 1.3 (secciones 3.5 y 3.6)</w:t>
+              <w:t>Pilar 2 — Diseño y Arquitectura, versión 1.7 (secciones 6 y 7) · Pilar 1 — Alcance, versión 1.7 (secciones 3.5 y 3.6)</w:t>
             </w:r>
           </w:p>
         </w:tc>
@@ -410,7 +410,7 @@
                 <w:sz w:val="17"/>
                 <w:szCs w:val="17"/>
               </w:rPr>
-              <w:t>Aprobado por el equipo el 14 de septiembre de 2026. Los trece ajustes de la sección 3 quedaron aceptados y la sección 6 del Pilar 2, en su versión 1.5, remite a este anexo en lugar de repetir los atributos. La versión 1.3 precisa cuándo nace la fila de usuario_ref, que la versión anterior ataba a declarar un perfil de tutor y dejaba sin fila a quien solo solicita tutorías. Este documento es la fuente del esquema: las migraciones iniciales se escriben desde las secciones 4 a 7.</w:t>
+              <w:t>Aprobado por el equipo el 14 de septiembre de 2026. Los trece ajustes de la sección 3 quedaron aceptados y la sección 6 del Pilar 2 remite a este anexo en lugar de repetir los atributos. La versión 1.3 precisa cuándo nace la fila de usuario_ref, que la versión anterior ataba a declarar un perfil de tutor y dejaba sin fila a quien solo solicita tutorías. La versión 1.4 corrige la sección 12: Identidad no valida la carrera ni la sede contra Catálogo, se validan donde se usan (AD-15 del Pilar 2). Dice además que carrera, nivel y sede quedan en nulo hasta que el usuario completa su perfil, y que los diagramas están escritos pero todavía no en el repositorio. El código de los cinco diagramas se pone al día con sus archivos .mmd: el documento mostraba una versión anterior, sin la relación de quién cancela una reserva ni la columna activo de usuario_ref en la vista global, y con cardinalidades obligatorias donde el modelo admite que falte el dato: la carrera y la sede del usuario, su fila en usuario_ref y la copia de cada asignatura. Este documento es la fuente del esquema: las migraciones iniciales se escriben desde las secciones 4 a 7.</w:t>
             </w:r>
           </w:p>
         </w:tc>
@@ -2394,7 +2394,7 @@
           <w:sz w:val="14"/>
           <w:szCs w:val="14"/>
         </w:rPr>
-        <w:t xml:space="preserve">        uuid id PK "gen_random_uuid"</w:t>
+        <w:t xml:space="preserve">        uuid id PK "gen_random_uuid · viaja como sub del JWT"</w:t>
       </w:r>
     </w:p>
     <w:p>
@@ -2407,7 +2407,7 @@
           <w:sz w:val="14"/>
           <w:szCs w:val="14"/>
         </w:rPr>
-        <w:t xml:space="preserve">        varchar email UK "150 · único por lower email · CHECK dominio duocuc.cl"</w:t>
+        <w:t xml:space="preserve">        varchar email UK "150 · único por lower(email) · CHECK dominio duocuc.cl"</w:t>
       </w:r>
     </w:p>
     <w:p>
@@ -2420,7 +2420,7 @@
           <w:sz w:val="14"/>
           <w:szCs w:val="14"/>
         </w:rPr>
-        <w:t xml:space="preserve">        varchar password_hash "128 · Argon2 o PBKDF2"</w:t>
+        <w:t xml:space="preserve">        varchar password_hash "128 · Argon2 o PBKDF2 · nunca sale del servicio"</w:t>
       </w:r>
     </w:p>
     <w:p>
@@ -2433,7 +2433,7 @@
           <w:sz w:val="14"/>
           <w:szCs w:val="14"/>
         </w:rPr>
-        <w:t xml:space="preserve">        varchar nombre "80 · NOT NULL"</w:t>
+        <w:t xml:space="preserve">        varchar nombre "80 · se copia a tutoring_db.usuario_ref"</w:t>
       </w:r>
     </w:p>
     <w:p>
@@ -2446,7 +2446,7 @@
           <w:sz w:val="14"/>
           <w:szCs w:val="14"/>
         </w:rPr>
-        <w:t xml:space="preserve">        varchar apellido "80 · NOT NULL"</w:t>
+        <w:t xml:space="preserve">        varchar apellido "80 · se copia a tutoring_db.usuario_ref"</w:t>
       </w:r>
     </w:p>
     <w:p>
@@ -2459,7 +2459,7 @@
           <w:sz w:val="14"/>
           <w:szCs w:val="14"/>
         </w:rPr>
-        <w:t xml:space="preserve">        uuid carrera_id "NULL · ref. lógica a catalog_db.carrera"</w:t>
+        <w:t xml:space="preserve">        uuid carrera_id "NULL · referencia lógica a catalog_db.carrera"</w:t>
       </w:r>
     </w:p>
     <w:p>
@@ -2472,7 +2472,7 @@
           <w:sz w:val="14"/>
           <w:szCs w:val="14"/>
         </w:rPr>
-        <w:t xml:space="preserve">        smallint nivel "NULL · CHECK entre 1 y 12 · semestre que cursa"</w:t>
+        <w:t xml:space="preserve">        smallint nivel "NULL · CHECK 1 a 12 · no se copia (A-11) · el programador lo lee para revalidar RN-01 (A-13)"</w:t>
       </w:r>
     </w:p>
     <w:p>
@@ -2485,7 +2485,7 @@
           <w:sz w:val="14"/>
           <w:szCs w:val="14"/>
         </w:rPr>
-        <w:t xml:space="preserve">        uuid sede_id "NULL · ref. lógica a catalog_db.sede"</w:t>
+        <w:t xml:space="preserve">        uuid sede_id "NULL · referencia lógica a catalog_db.sede (A-07)"</w:t>
       </w:r>
     </w:p>
     <w:p>
@@ -2498,7 +2498,7 @@
           <w:sz w:val="14"/>
           <w:szCs w:val="14"/>
         </w:rPr>
-        <w:t xml:space="preserve">        boolean email_verificado "DEFAULT false · RN-08"</w:t>
+        <w:t xml:space="preserve">        boolean email_verificado "DEFAULT false · sin verificar no inicia sesión · RN-08"</w:t>
       </w:r>
     </w:p>
     <w:p>
@@ -2511,7 +2511,7 @@
           <w:sz w:val="14"/>
           <w:szCs w:val="14"/>
         </w:rPr>
-        <w:t xml:space="preserve">        boolean activo "DEFAULT true · RN-08"</w:t>
+        <w:t xml:space="preserve">        boolean activo "DEFAULT true · desactivar revoca los refresh_token · CA7"</w:t>
       </w:r>
     </w:p>
     <w:p>
@@ -2524,7 +2524,7 @@
           <w:sz w:val="14"/>
           <w:szCs w:val="14"/>
         </w:rPr>
-        <w:t xml:space="preserve">        boolean es_admin "DEFAULT false · marca del token"</w:t>
+        <w:t xml:space="preserve">        boolean es_admin "DEFAULT false · único origen de la marca del token · AD-09"</w:t>
       </w:r>
     </w:p>
     <w:p>
@@ -2550,7 +2550,7 @@
           <w:sz w:val="14"/>
           <w:szCs w:val="14"/>
         </w:rPr>
-        <w:t xml:space="preserve">        timestamptz actualizado_en "DEFAULT now"</w:t>
+        <w:t xml:space="preserve">        timestamptz actualizado_en "DEFAULT now · detecta copias de lectura desfasadas"</w:t>
       </w:r>
     </w:p>
     <w:p>
@@ -2589,7 +2589,7 @@
           <w:sz w:val="14"/>
           <w:szCs w:val="14"/>
         </w:rPr>
-        <w:t xml:space="preserve">        bigserial id PK "no cruza fronteras"</w:t>
+        <w:t xml:space="preserve">        bigserial id PK "interna · no cruza fronteras"</w:t>
       </w:r>
     </w:p>
     <w:p>
@@ -2615,7 +2615,7 @@
           <w:sz w:val="14"/>
           <w:szCs w:val="14"/>
         </w:rPr>
-        <w:t xml:space="preserve">        varchar token_hash UK "64 · sha256 del token enviado por correo"</w:t>
+        <w:t xml:space="preserve">        varchar token_hash UK "64 · sha256 del token enviado por correo (A-12)"</w:t>
       </w:r>
     </w:p>
     <w:p>
@@ -2628,7 +2628,7 @@
           <w:sz w:val="14"/>
           <w:szCs w:val="14"/>
         </w:rPr>
-        <w:t xml:space="preserve">        timestamptz expira_en "creado_en más 24 horas"</w:t>
+        <w:t xml:space="preserve">        timestamptz expira_en "creado_en más 24 horas · CHECK posterior a creado_en"</w:t>
       </w:r>
     </w:p>
     <w:p>
@@ -2641,7 +2641,7 @@
           <w:sz w:val="14"/>
           <w:szCs w:val="14"/>
         </w:rPr>
-        <w:t xml:space="preserve">        timestamptz usado_en "NULL · un solo uso"</w:t>
+        <w:t xml:space="preserve">        timestamptz usado_en "NULL · un solo uso · CA1"</w:t>
       </w:r>
     </w:p>
     <w:p>
@@ -2693,7 +2693,7 @@
           <w:sz w:val="14"/>
           <w:szCs w:val="14"/>
         </w:rPr>
-        <w:t xml:space="preserve">        bigserial id PK "no cruza fronteras"</w:t>
+        <w:t xml:space="preserve">        bigserial id PK "interna · no cruza fronteras"</w:t>
       </w:r>
     </w:p>
     <w:p>
@@ -2719,7 +2719,7 @@
           <w:sz w:val="14"/>
           <w:szCs w:val="14"/>
         </w:rPr>
-        <w:t xml:space="preserve">        varchar token_hash UK "64 · nunca se guarda el token en claro"</w:t>
+        <w:t xml:space="preserve">        varchar token_hash UK "64 · nunca se guarda el token en claro · RNF-01"</w:t>
       </w:r>
     </w:p>
     <w:p>
@@ -2732,7 +2732,7 @@
           <w:sz w:val="14"/>
           <w:szCs w:val="14"/>
         </w:rPr>
-        <w:t xml:space="preserve">        timestamptz expira_en "creado_en más 7 días"</w:t>
+        <w:t xml:space="preserve">        timestamptz expira_en "creado_en más 7 días · CHECK posterior a creado_en"</w:t>
       </w:r>
     </w:p>
     <w:p>
@@ -2745,7 +2745,7 @@
           <w:sz w:val="14"/>
           <w:szCs w:val="14"/>
         </w:rPr>
-        <w:t xml:space="preserve">        timestamptz revocado_en "NULL · logout o desactivación de la cuenta"</w:t>
+        <w:t xml:space="preserve">        timestamptz revocado_en "NULL · logout, rotación o cuenta desactivada"</w:t>
       </w:r>
     </w:p>
     <w:p>
@@ -2797,7 +2797,7 @@
           <w:sz w:val="14"/>
           <w:szCs w:val="14"/>
         </w:rPr>
-        <w:t xml:space="preserve">        bigserial id PK "registro de lo enviado · RF-09"</w:t>
+        <w:t xml:space="preserve">        bigserial id PK "registro de lo enviado · RF-09 · nueva en A-08"</w:t>
       </w:r>
     </w:p>
     <w:p>
@@ -2810,7 +2810,7 @@
           <w:sz w:val="14"/>
           <w:szCs w:val="14"/>
         </w:rPr>
-        <w:t xml:space="preserve">        uuid usuario_id FK "ON DELETE CASCADE"</w:t>
+        <w:t xml:space="preserve">        uuid usuario_id FK "destinatario · ON DELETE CASCADE"</w:t>
       </w:r>
     </w:p>
     <w:p>
@@ -2823,7 +2823,7 @@
           <w:sz w:val="14"/>
           <w:szCs w:val="14"/>
         </w:rPr>
-        <w:t xml:space="preserve">        varchar plantilla "40 · CHECK sobre la lista de plantillas"</w:t>
+        <w:t xml:space="preserve">        varchar plantilla "40 · CHECK sobre las seis plantillas de la sección 8"</w:t>
       </w:r>
     </w:p>
     <w:p>
@@ -2849,7 +2849,7 @@
           <w:sz w:val="14"/>
           <w:szCs w:val="14"/>
         </w:rPr>
-        <w:t xml:space="preserve">        uuid referencia_id "NULL · reserva que originó el aviso"</w:t>
+        <w:t xml:space="preserve">        uuid referencia_id "NULL · reserva que originó el aviso · da idempotencia"</w:t>
       </w:r>
     </w:p>
     <w:p>
@@ -2875,7 +2875,7 @@
           <w:sz w:val="14"/>
           <w:szCs w:val="14"/>
         </w:rPr>
-        <w:t xml:space="preserve">        varchar error "300 · NULL"</w:t>
+        <w:t xml:space="preserve">        varchar error "300 · NULL · mensaje del servidor de correo"</w:t>
       </w:r>
     </w:p>
     <w:p>
@@ -4170,7 +4170,7 @@
                 <w:sz w:val="17"/>
                 <w:szCs w:val="17"/>
               </w:rPr>
-              <w:t xml:space="preserve">Semestre que cursa. CHECK entre 1 y 12. Insumo de RN-01; lo declara el propio usuario</w:t>
+              <w:t xml:space="preserve">Semestre que cursa. CHECK entre 1 y 12. Insumo de RN-01; lo declara el propio usuario. NULL hasta que complete su perfil</w:t>
             </w:r>
           </w:p>
         </w:tc>
@@ -4318,7 +4318,7 @@
                 <w:sz w:val="17"/>
                 <w:szCs w:val="17"/>
               </w:rPr>
-              <w:t xml:space="preserve">Referencia lógica a catalog_db.sede (ajuste A-07)</w:t>
+              <w:t xml:space="preserve">Referencia lógica a catalog_db.sede, sin FK (ajuste A-07). NULL hasta que el usuario complete su perfil</w:t>
             </w:r>
           </w:p>
         </w:tc>
@@ -9073,7 +9073,7 @@
           <w:sz w:val="14"/>
           <w:szCs w:val="14"/>
         </w:rPr>
-        <w:t xml:space="preserve">        varchar codigo UK "20 · código interno de la carrera"</w:t>
+        <w:t xml:space="preserve">        varchar codigo UK "20 · clave natural del CSV de carga"</w:t>
       </w:r>
     </w:p>
     <w:p>
@@ -9086,7 +9086,7 @@
           <w:sz w:val="14"/>
           <w:szCs w:val="14"/>
         </w:rPr>
-        <w:t xml:space="preserve">        varchar nombre "150"</w:t>
+        <w:t xml:space="preserve">        varchar nombre "150 · se copia a usuario_ref.carrera_nombre"</w:t>
       </w:r>
     </w:p>
     <w:p>
@@ -9099,7 +9099,7 @@
           <w:sz w:val="14"/>
           <w:szCs w:val="14"/>
         </w:rPr>
-        <w:t xml:space="preserve">        varchar escuela "120 · etiqueta · no se filtra en el MVP"</w:t>
+        <w:t xml:space="preserve">        varchar escuela "120 · etiqueta · ninguna consulta del MVP filtra por ella"</w:t>
       </w:r>
     </w:p>
     <w:p>
@@ -9112,7 +9112,7 @@
           <w:sz w:val="14"/>
           <w:szCs w:val="14"/>
         </w:rPr>
-        <w:t xml:space="preserve">        boolean activa "DEFAULT true"</w:t>
+        <w:t xml:space="preserve">        boolean activa "DEFAULT true · borrado lógico"</w:t>
       </w:r>
     </w:p>
     <w:p>
@@ -9164,7 +9164,7 @@
           <w:sz w:val="14"/>
           <w:szCs w:val="14"/>
         </w:rPr>
-        <w:t xml:space="preserve">        bigserial id PK</w:t>
+        <w:t xml:space="preserve">        bigserial id PK "interna · no cruza fronteras"</w:t>
       </w:r>
     </w:p>
     <w:p>
@@ -9190,7 +9190,7 @@
           <w:sz w:val="14"/>
           <w:szCs w:val="14"/>
         </w:rPr>
-        <w:t xml:space="preserve">        varchar version "20 · año del plan de estudios"</w:t>
+        <w:t xml:space="preserve">        varchar version "20 · año del plan de estudios · único por carrera"</w:t>
       </w:r>
     </w:p>
     <w:p>
@@ -9216,7 +9216,7 @@
           <w:sz w:val="14"/>
           <w:szCs w:val="14"/>
         </w:rPr>
-        <w:t xml:space="preserve">        date vigente_hasta "NULL significa malla vigente · única por carrera"</w:t>
+        <w:t xml:space="preserve">        date vigente_hasta "NULL significa malla vigente · una sola por carrera"</w:t>
       </w:r>
     </w:p>
     <w:p>
@@ -9268,7 +9268,7 @@
           <w:sz w:val="14"/>
           <w:szCs w:val="14"/>
         </w:rPr>
-        <w:t xml:space="preserve">        uuid id PK "cruza a tutoring_db"</w:t>
+        <w:t xml:space="preserve">        uuid id PK "cruza a tutoring_db.asignatura_ref"</w:t>
       </w:r>
     </w:p>
     <w:p>
@@ -9281,7 +9281,7 @@
           <w:sz w:val="14"/>
           <w:szCs w:val="14"/>
         </w:rPr>
-        <w:t xml:space="preserve">        varchar sigla UK "15 · transversal entre carreras"</w:t>
+        <w:t xml:space="preserve">        varchar sigla UK "15 · transversal entre carreras · clave natural del CSV"</w:t>
       </w:r>
     </w:p>
     <w:p>
@@ -9294,7 +9294,7 @@
           <w:sz w:val="14"/>
           <w:szCs w:val="14"/>
         </w:rPr>
-        <w:t xml:space="preserve">        varchar nombre "150 · índice trigram para la búsqueda"</w:t>
+        <w:t xml:space="preserve">        varchar nombre "150 · índice GIN trigram para la búsqueda · RNF-02"</w:t>
       </w:r>
     </w:p>
     <w:p>
@@ -9372,7 +9372,7 @@
           <w:sz w:val="14"/>
           <w:szCs w:val="14"/>
         </w:rPr>
-        <w:t xml:space="preserve">        bigserial id PK</w:t>
+        <w:t xml:space="preserve">        bigserial id PK "interna"</w:t>
       </w:r>
     </w:p>
     <w:p>
@@ -9398,7 +9398,7 @@
           <w:sz w:val="14"/>
           <w:szCs w:val="14"/>
         </w:rPr>
-        <w:t xml:space="preserve">        uuid asignatura_id FK "ON DELETE RESTRICT"</w:t>
+        <w:t xml:space="preserve">        uuid asignatura_id FK "ON DELETE RESTRICT · único junto a malla_id"</w:t>
       </w:r>
     </w:p>
     <w:p>
@@ -9411,7 +9411,7 @@
           <w:sz w:val="14"/>
           <w:szCs w:val="14"/>
         </w:rPr>
-        <w:t xml:space="preserve">        smallint semestre "CHECK entre 1 y 12 · sostiene la regla RN-01"</w:t>
+        <w:t xml:space="preserve">        smallint semestre "CHECK entre 1 y 12 · se compara con usuario.nivel en RN-01"</w:t>
       </w:r>
     </w:p>
     <w:p>
@@ -9450,7 +9450,7 @@
           <w:sz w:val="14"/>
           <w:szCs w:val="14"/>
         </w:rPr>
-        <w:t xml:space="preserve">        bigserial id PK "estructura preparada · sin uso en el MVP"</w:t>
+        <w:t xml:space="preserve">        bigserial id PK "estructura preparada · sin uso funcional en el MVP"</w:t>
       </w:r>
     </w:p>
     <w:p>
@@ -9476,7 +9476,7 @@
           <w:sz w:val="14"/>
           <w:szCs w:val="14"/>
         </w:rPr>
-        <w:t xml:space="preserve">        bigint requiere_id FK "ON DELETE CASCADE · CHECK distinto de la anterior"</w:t>
+        <w:t xml:space="preserve">        bigint requiere_id FK "ON DELETE CASCADE · CHECK distinto del anterior"</w:t>
       </w:r>
     </w:p>
     <w:p>
@@ -9515,7 +9515,7 @@
           <w:sz w:val="14"/>
           <w:szCs w:val="14"/>
         </w:rPr>
-        <w:t xml:space="preserve">        uuid id PK "cruza a identity_db y a tutoring_db"</w:t>
+        <w:t xml:space="preserve">        uuid id PK "cruza a identity_db y a tutoring_db · nueva en A-07"</w:t>
       </w:r>
     </w:p>
     <w:p>
@@ -9541,7 +9541,7 @@
           <w:sz w:val="14"/>
           <w:szCs w:val="14"/>
         </w:rPr>
-        <w:t xml:space="preserve">        varchar nombre "120"</w:t>
+        <w:t xml:space="preserve">        varchar nombre "120 · se copia a usuario_ref.sede_nombre"</w:t>
       </w:r>
     </w:p>
     <w:p>
@@ -9619,7 +9619,7 @@
           <w:sz w:val="14"/>
           <w:szCs w:val="14"/>
         </w:rPr>
-        <w:t xml:space="preserve">        varchar archivo "200"</w:t>
+        <w:t xml:space="preserve">        varchar archivo "200 · nombre del CSV procesado"</w:t>
       </w:r>
     </w:p>
     <w:p>
@@ -9697,7 +9697,7 @@
           <w:sz w:val="14"/>
           <w:szCs w:val="14"/>
         </w:rPr>
-        <w:t xml:space="preserve">        uuid ejecutada_por "NULL · ref. lógica al usuario administrador"</w:t>
+        <w:t xml:space="preserve">        uuid ejecutada_por "NULL · referencia lógica al usuario administrador"</w:t>
       </w:r>
     </w:p>
     <w:p>
@@ -17534,7 +17534,7 @@
           <w:sz w:val="14"/>
           <w:szCs w:val="14"/>
         </w:rPr>
-        <w:t xml:space="preserve">        uuid usuario_id PK "copia de lectura · ref. lógica a identity_db.usuario"</w:t>
+        <w:t xml:space="preserve">        uuid usuario_id PK "el id de identity_db es la PK · la fila nace al primer contacto con Tutorías"</w:t>
       </w:r>
     </w:p>
     <w:p>
@@ -17547,7 +17547,7 @@
           <w:sz w:val="14"/>
           <w:szCs w:val="14"/>
         </w:rPr>
-        <w:t xml:space="preserve">        varchar nombre "80"</w:t>
+        <w:t xml:space="preserve">        varchar nombre "80 · copia"</w:t>
       </w:r>
     </w:p>
     <w:p>
@@ -17560,7 +17560,7 @@
           <w:sz w:val="14"/>
           <w:szCs w:val="14"/>
         </w:rPr>
-        <w:t xml:space="preserve">        varchar apellido "80"</w:t>
+        <w:t xml:space="preserve">        varchar apellido "80 · copia"</w:t>
       </w:r>
     </w:p>
     <w:p>
@@ -17573,7 +17573,7 @@
           <w:sz w:val="14"/>
           <w:szCs w:val="14"/>
         </w:rPr>
-        <w:t xml:space="preserve">        uuid carrera_id "NULL"</w:t>
+        <w:t xml:space="preserve">        uuid carrera_id "NULL · copia"</w:t>
       </w:r>
     </w:p>
     <w:p>
@@ -17586,7 +17586,7 @@
           <w:sz w:val="14"/>
           <w:szCs w:val="14"/>
         </w:rPr>
-        <w:t xml:space="preserve">        varchar carrera_nombre "150 · NULL · lo entrega Catálogo"</w:t>
+        <w:t xml:space="preserve">        varchar carrera_nombre "150 · NULL · lo entrega Catálogo, no Identidad"</w:t>
       </w:r>
     </w:p>
     <w:p>
@@ -17599,7 +17599,7 @@
           <w:sz w:val="14"/>
           <w:szCs w:val="14"/>
         </w:rPr>
-        <w:t xml:space="preserve">        uuid sede_id "NULL"</w:t>
+        <w:t xml:space="preserve">        uuid sede_id "NULL · copia"</w:t>
       </w:r>
     </w:p>
     <w:p>
@@ -17625,7 +17625,7 @@
           <w:sz w:val="14"/>
           <w:szCs w:val="14"/>
         </w:rPr>
-        <w:t xml:space="preserve">        boolean activo "DEFAULT true · RN-08 lo excluye de la búsqueda"</w:t>
+        <w:t xml:space="preserve">        boolean activo "DEFAULT true · sin esta columna RN-08 no se cumple (A-01) · hasta 5 min de desfase"</w:t>
       </w:r>
     </w:p>
     <w:p>
@@ -17651,7 +17651,7 @@
           <w:sz w:val="14"/>
           <w:szCs w:val="14"/>
         </w:rPr>
-        <w:t xml:space="preserve">        integer reputacion_total "DEFAULT 0 · evaluaciones visibles"</w:t>
+        <w:t xml:space="preserve">        integer reputacion_total "DEFAULT 0 · evaluaciones visibles · CHECK no negativa"</w:t>
       </w:r>
     </w:p>
     <w:p>
@@ -17664,7 +17664,7 @@
           <w:sz w:val="14"/>
           <w:szCs w:val="14"/>
         </w:rPr>
-        <w:t xml:space="preserve">        timestamptz actualizado_en "DEFAULT now · marca el desfase"</w:t>
+        <w:t xml:space="preserve">        timestamptz actualizado_en "DEFAULT now · mide el desfase que AD-07 acepta"</w:t>
       </w:r>
     </w:p>
     <w:p>
@@ -17703,7 +17703,7 @@
           <w:sz w:val="14"/>
           <w:szCs w:val="14"/>
         </w:rPr>
-        <w:t xml:space="preserve">        uuid asignatura_id PK "copia de lectura · ref. lógica a catalog_db.asignatura"</w:t>
+        <w:t xml:space="preserve">        uuid asignatura_id PK "copia de lectura de catalog_db.asignatura"</w:t>
       </w:r>
     </w:p>
     <w:p>
@@ -17716,7 +17716,7 @@
           <w:sz w:val="14"/>
           <w:szCs w:val="14"/>
         </w:rPr>
-        <w:t xml:space="preserve">        varchar sigla "15"</w:t>
+        <w:t xml:space="preserve">        varchar sigla "15 · copia"</w:t>
       </w:r>
     </w:p>
     <w:p>
@@ -17729,7 +17729,7 @@
           <w:sz w:val="14"/>
           <w:szCs w:val="14"/>
         </w:rPr>
-        <w:t xml:space="preserve">        varchar nombre "150"</w:t>
+        <w:t xml:space="preserve">        varchar nombre "150 · copia"</w:t>
       </w:r>
     </w:p>
     <w:p>
@@ -17781,7 +17781,7 @@
           <w:sz w:val="14"/>
           <w:szCs w:val="14"/>
         </w:rPr>
-        <w:t xml:space="preserve">        uuid id PK</w:t>
+        <w:t xml:space="preserve">        uuid id PK "se expone en PATCH /perfiles/{id}"</w:t>
       </w:r>
     </w:p>
     <w:p>
@@ -17807,7 +17807,7 @@
           <w:sz w:val="14"/>
           <w:szCs w:val="14"/>
         </w:rPr>
-        <w:t xml:space="preserve">        uuid asignatura_id FK "ON DELETE RESTRICT · validado con RN-01"</w:t>
+        <w:t xml:space="preserve">        uuid asignatura_id FK "ON DELETE RESTRICT · habilitación validada con RN-01"</w:t>
       </w:r>
     </w:p>
     <w:p>
@@ -17820,7 +17820,7 @@
           <w:sz w:val="14"/>
           <w:szCs w:val="14"/>
         </w:rPr>
-        <w:t xml:space="preserve">        numeric tarifa "8 enteros en pesos · DEFAULT 0 · CHECK no negativa"</w:t>
+        <w:t xml:space="preserve">        numeric tarifa "8 enteros en pesos · DEFAULT 0 · CHECK no negativa · RN-05"</w:t>
       </w:r>
     </w:p>
     <w:p>
@@ -17911,7 +17911,7 @@
           <w:sz w:val="14"/>
           <w:szCs w:val="14"/>
         </w:rPr>
-        <w:t xml:space="preserve">        uuid id PK</w:t>
+        <w:t xml:space="preserve">        uuid id PK "gen_random_uuid"</w:t>
       </w:r>
     </w:p>
     <w:p>
@@ -17937,7 +17937,7 @@
           <w:sz w:val="14"/>
           <w:szCs w:val="14"/>
         </w:rPr>
-        <w:t xml:space="preserve">        timestamptz inicio_en "UTC · solo fechas futuras al crear"</w:t>
+        <w:t xml:space="preserve">        timestamptz inicio_en "UTC · dos instantes en vez de fecha y horas (A-02) · solo futuro al crear"</w:t>
       </w:r>
     </w:p>
     <w:p>
@@ -17950,7 +17950,7 @@
           <w:sz w:val="14"/>
           <w:szCs w:val="14"/>
         </w:rPr>
-        <w:t xml:space="preserve">        timestamptz fin_en "CHECK posterior a inicio_en"</w:t>
+        <w:t xml:space="preserve">        timestamptz fin_en "CHECK posterior a inicio_en · EXCLUDE gist impide solapar · RN-02"</w:t>
       </w:r>
     </w:p>
     <w:p>
@@ -17963,7 +17963,7 @@
           <w:sz w:val="14"/>
           <w:szCs w:val="14"/>
         </w:rPr>
-        <w:t xml:space="preserve">        varchar estado "10 · LIBRE u OCUPADO"</w:t>
+        <w:t xml:space="preserve">        varchar estado "10 · LIBRE u OCUPADO · pasa a OCUPADO al confirmar"</w:t>
       </w:r>
     </w:p>
     <w:p>
@@ -18028,7 +18028,7 @@
           <w:sz w:val="14"/>
           <w:szCs w:val="14"/>
         </w:rPr>
-        <w:t xml:space="preserve">        uuid id PK "cruza a payment_db"</w:t>
+        <w:t xml:space="preserve">        uuid id PK "cruza a payment_db.pago.reserva_id"</w:t>
       </w:r>
     </w:p>
     <w:p>
@@ -18041,7 +18041,7 @@
           <w:sz w:val="14"/>
           <w:szCs w:val="14"/>
         </w:rPr>
-        <w:t xml:space="preserve">        uuid bloque_id FK "ON DELETE RESTRICT"</w:t>
+        <w:t xml:space="preserve">        uuid bloque_id FK "ON DELETE RESTRICT · único parcial por estado ocupado (A-03)"</w:t>
       </w:r>
     </w:p>
     <w:p>
@@ -18093,7 +18093,7 @@
           <w:sz w:val="14"/>
           <w:szCs w:val="14"/>
         </w:rPr>
-        <w:t xml:space="preserve">        varchar estado "12 · siete valores de la máquina de estados"</w:t>
+        <w:t xml:space="preserve">        varchar estado "12 · DEFAULT SOLICITADA · siete valores · ver sección 9"</w:t>
       </w:r>
     </w:p>
     <w:p>
@@ -18119,7 +18119,7 @@
           <w:sz w:val="14"/>
           <w:szCs w:val="14"/>
         </w:rPr>
-        <w:t xml:space="preserve">        varchar modalidad "12 · NULL · PRESENCIAL o EN_LINEA · RN-07"</w:t>
+        <w:t xml:space="preserve">        varchar modalidad "12 · NULL · PRESENCIAL o EN_LINEA · obligatoria al confirmar · RN-07"</w:t>
       </w:r>
     </w:p>
     <w:p>
@@ -18132,7 +18132,7 @@
           <w:sz w:val="14"/>
           <w:szCs w:val="14"/>
         </w:rPr>
-        <w:t xml:space="preserve">        varchar lugar_o_enlace "300 · NULL · lo indica el tutor al confirmar"</w:t>
+        <w:t xml:space="preserve">        varchar lugar_o_enlace "300 · NULL · lo indica el tutor al confirmar · RN-07"</w:t>
       </w:r>
     </w:p>
     <w:p>
@@ -18145,7 +18145,7 @@
           <w:sz w:val="14"/>
           <w:szCs w:val="14"/>
         </w:rPr>
-        <w:t xml:space="preserve">        numeric monto "8 enteros · copia de la tarifa al solicitar"</w:t>
+        <w:t xml:space="preserve">        numeric monto "8 enteros · copia congelada de la tarifa al solicitar (A-04)"</w:t>
       </w:r>
     </w:p>
     <w:p>
@@ -18158,7 +18158,7 @@
           <w:sz w:val="14"/>
           <w:szCs w:val="14"/>
         </w:rPr>
-        <w:t xml:space="preserve">        varchar estado_pago "12 · NULL · copia de lectura de Pagos"</w:t>
+        <w:t xml:space="preserve">        varchar estado_pago "12 · NULL · copia de lectura de Pagos · NULL si monto es 0"</w:t>
       </w:r>
     </w:p>
     <w:p>
@@ -18171,7 +18171,7 @@
           <w:sz w:val="14"/>
           <w:szCs w:val="14"/>
         </w:rPr>
-        <w:t xml:space="preserve">        timestamptz pago_actualizado_en "NULL · descarta avisos fuera de orden"</w:t>
+        <w:t xml:space="preserve">        timestamptz pago_actualizado_en "NULL · descarta avisos fuera de orden (A-06)"</w:t>
       </w:r>
     </w:p>
     <w:p>
@@ -18184,7 +18184,7 @@
           <w:sz w:val="14"/>
           <w:szCs w:val="14"/>
         </w:rPr>
-        <w:t xml:space="preserve">        uuid cancelada_por_usuario_id FK "NULL · RN-04 · quién canceló"</w:t>
+        <w:t xml:space="preserve">        uuid cancelada_por_usuario_id FK "NULL · quién canceló · RN-04 (A-05)"</w:t>
       </w:r>
     </w:p>
     <w:p>
@@ -18262,7 +18262,7 @@
           <w:sz w:val="14"/>
           <w:szCs w:val="14"/>
         </w:rPr>
-        <w:t xml:space="preserve">        uuid id PK</w:t>
+        <w:t xml:space="preserve">        uuid id PK "se expone en DELETE /admin/evaluaciones/{id}"</w:t>
       </w:r>
     </w:p>
     <w:p>
@@ -18275,7 +18275,7 @@
           <w:sz w:val="14"/>
           <w:szCs w:val="14"/>
         </w:rPr>
-        <w:t xml:space="preserve">        uuid reserva_id FK "UK · una sola evaluación por reserva · RN-06"</w:t>
+        <w:t xml:space="preserve">        uuid reserva_id FK,UK "ON DELETE CASCADE · una sola por reserva · RN-06"</w:t>
       </w:r>
     </w:p>
     <w:p>
@@ -18288,7 +18288,7 @@
           <w:sz w:val="14"/>
           <w:szCs w:val="14"/>
         </w:rPr>
-        <w:t xml:space="preserve">        smallint calificacion "CHECK entre 1 y 5"</w:t>
+        <w:t xml:space="preserve">        smallint calificacion "CHECK entre 1 y 5 · RN-06"</w:t>
       </w:r>
     </w:p>
     <w:p>
@@ -18314,7 +18314,7 @@
           <w:sz w:val="14"/>
           <w:szCs w:val="14"/>
         </w:rPr>
-        <w:t xml:space="preserve">        timestamptz retirada_en "NULL · retirada deja de contar · CA7"</w:t>
+        <w:t xml:space="preserve">        timestamptz retirada_en "NULL · retirada deja de contar en la reputación · CA7"</w:t>
       </w:r>
     </w:p>
     <w:p>
@@ -18327,7 +18327,7 @@
           <w:sz w:val="14"/>
           <w:szCs w:val="14"/>
         </w:rPr>
-        <w:t xml:space="preserve">        uuid retirada_por_usuario_id "NULL · administrador que la retiró"</w:t>
+        <w:t xml:space="preserve">        uuid retirada_por_usuario_id "NULL · referencia lógica al administrador"</w:t>
       </w:r>
     </w:p>
     <w:p>
@@ -18379,7 +18379,7 @@
           <w:sz w:val="14"/>
           <w:szCs w:val="14"/>
         </w:rPr>
-        <w:t xml:space="preserve">        bigserial id PK "evidencia del programador · AD-10"</w:t>
+        <w:t xml:space="preserve">        bigserial id PK "evidencia del programador · AD-10 · nueva en A-09"</w:t>
       </w:r>
     </w:p>
     <w:p>
@@ -18392,7 +18392,7 @@
           <w:sz w:val="14"/>
           <w:szCs w:val="14"/>
         </w:rPr>
-        <w:t xml:space="preserve">        varchar comando "40"</w:t>
+        <w:t xml:space="preserve">        varchar comando "40 · nombre del comando de Django ejecutado"</w:t>
       </w:r>
     </w:p>
     <w:p>
@@ -18405,7 +18405,7 @@
           <w:sz w:val="14"/>
           <w:szCs w:val="14"/>
         </w:rPr>
-        <w:t xml:space="preserve">        integer solicitudes_expiradas "DEFAULT 0"</w:t>
+        <w:t xml:space="preserve">        integer solicitudes_expiradas "DEFAULT 0 · RN-03"</w:t>
       </w:r>
     </w:p>
     <w:p>
@@ -18418,7 +18418,7 @@
           <w:sz w:val="14"/>
           <w:szCs w:val="14"/>
         </w:rPr>
-        <w:t xml:space="preserve">        integer reservas_cerradas "DEFAULT 0"</w:t>
+        <w:t xml:space="preserve">        integer reservas_cerradas "DEFAULT 0 · paso a REALIZADA"</w:t>
       </w:r>
     </w:p>
     <w:p>
@@ -18431,7 +18431,7 @@
           <w:sz w:val="14"/>
           <w:szCs w:val="14"/>
         </w:rPr>
-        <w:t xml:space="preserve">        integer refs_sincronizadas "DEFAULT 0"</w:t>
+        <w:t xml:space="preserve">        integer refs_sincronizadas "DEFAULT 0 · copias de lectura refrescadas (A-01)"</w:t>
       </w:r>
     </w:p>
     <w:p>
@@ -18444,7 +18444,7 @@
           <w:sz w:val="14"/>
           <w:szCs w:val="14"/>
         </w:rPr>
-        <w:t>integer perfiles_desactivados "DEFAULT 0 · revalidación de RN-01 · A-13"</w:t>
+        <w:t xml:space="preserve">        integer perfiles_desactivados "DEFAULT 0 · revalidación de RN-01 al cambiar carrera o nivel (A-13)"</w:t>
       </w:r>
     </w:p>
     <w:p>
@@ -18483,7 +18483,7 @@
           <w:sz w:val="14"/>
           <w:szCs w:val="14"/>
         </w:rPr>
-        <w:t xml:space="preserve">        timestamptz terminada_en "NULL"</w:t>
+        <w:t xml:space="preserve">        timestamptz terminada_en "NULL indica una ejecución interrumpida"</w:t>
       </w:r>
     </w:p>
     <w:p>
@@ -18575,6 +18575,19 @@
           <w:szCs w:val="14"/>
         </w:rPr>
         <w:t xml:space="preserve">    usuario_ref ||--o{ reserva : "solicita como estudiante"</w:t>
+      </w:r>
+    </w:p>
+    <w:p>
+      <w:pPr>
+        <w:spacing w:after="0"/>
+      </w:pPr>
+      <w:r>
+        <w:rPr>
+          <w:rFonts w:ascii="Consolas" w:cs="Consolas" w:eastAsia="Consolas" w:hAnsi="Consolas"/>
+          <w:sz w:val="14"/>
+          <w:szCs w:val="14"/>
+        </w:rPr>
+        <w:t xml:space="preserve">    usuario_ref |o--o{ reserva : "canceló · RN-04"</w:t>
       </w:r>
     </w:p>
     <w:p>
@@ -29918,7 +29931,7 @@
           <w:sz w:val="14"/>
           <w:szCs w:val="14"/>
         </w:rPr>
-        <w:t xml:space="preserve">        uuid id PK</w:t>
+        <w:t xml:space="preserve">        uuid id PK "gen_random_uuid"</w:t>
       </w:r>
     </w:p>
     <w:p>
@@ -29931,7 +29944,7 @@
           <w:sz w:val="14"/>
           <w:szCs w:val="14"/>
         </w:rPr>
-        <w:t xml:space="preserve">        uuid reserva_id UK "ref. lógica a tutoring_db.reserva · un pago por reserva"</w:t>
+        <w:t xml:space="preserve">        uuid reserva_id UK "referencia lógica a tutoring_db.reserva · un pago por reserva"</w:t>
       </w:r>
     </w:p>
     <w:p>
@@ -29944,7 +29957,7 @@
           <w:sz w:val="14"/>
           <w:szCs w:val="14"/>
         </w:rPr>
-        <w:t xml:space="preserve">        numeric monto "8 enteros en pesos · CHECK mayor que cero"</w:t>
+        <w:t xml:space="preserve">        numeric monto "8 enteros en pesos · CHECK mayor que cero · sin tarifa no hay pago"</w:t>
       </w:r>
     </w:p>
     <w:p>
@@ -29957,7 +29970,7 @@
           <w:sz w:val="14"/>
           <w:szCs w:val="14"/>
         </w:rPr>
-        <w:t xml:space="preserve">        varchar estado "12 · PENDIENTE, PAGADO, FALLIDO o REEMBOLSADO"</w:t>
+        <w:t xml:space="preserve">        varchar estado "12 · DEFAULT PENDIENTE · PAGADO, FALLIDO o REEMBOLSADO · RN-05"</w:t>
       </w:r>
     </w:p>
     <w:p>
@@ -29970,7 +29983,7 @@
           <w:sz w:val="14"/>
           <w:szCs w:val="14"/>
         </w:rPr>
-        <w:t xml:space="preserve">        varchar proveedor "30 · DEFAULT SIMULADO · punto de integración real"</w:t>
+        <w:t xml:space="preserve">        varchar proveedor "30 · DEFAULT SIMULADO · punto de integración real · RF-18"</w:t>
       </w:r>
     </w:p>
     <w:p>
@@ -29996,7 +30009,7 @@
           <w:sz w:val="14"/>
           <w:szCs w:val="14"/>
         </w:rPr>
-        <w:t xml:space="preserve">        timestamptz notificado_en "NULL · aviso a Tutorías ya confirmado"</w:t>
+        <w:t xml:space="preserve">        timestamptz notificado_en "NULL · Tutorías ya confirmó el aviso · permite reintentar"</w:t>
       </w:r>
     </w:p>
     <w:p>
@@ -30061,7 +30074,7 @@
           <w:sz w:val="14"/>
           <w:szCs w:val="14"/>
         </w:rPr>
-        <w:t xml:space="preserve">        bigserial id PK "historial de reintentos · RN-05"</w:t>
+        <w:t xml:space="preserve">        bigserial id PK "historial de reintentos · RN-05 y CA9 · nueva en A-10"</w:t>
       </w:r>
     </w:p>
     <w:p>
@@ -30087,7 +30100,7 @@
           <w:sz w:val="14"/>
           <w:szCs w:val="14"/>
         </w:rPr>
-        <w:t xml:space="preserve">        varchar tipo "10 · COBRO o REEMBOLSO"</w:t>
+        <w:t xml:space="preserve">        varchar tipo "10 · DEFAULT COBRO · COBRO o REEMBOLSO"</w:t>
       </w:r>
     </w:p>
     <w:p>
@@ -36798,7 +36811,7 @@
           <w:sz w:val="14"/>
           <w:szCs w:val="14"/>
         </w:rPr>
-        <w:t xml:space="preserve">        varchar email UK "solo existe aquí"</w:t>
+        <w:t xml:space="preserve">        varchar email UK "solo existe aquí · RNF-07"</w:t>
       </w:r>
     </w:p>
     <w:p>
@@ -36837,7 +36850,7 @@
           <w:sz w:val="14"/>
           <w:szCs w:val="14"/>
         </w:rPr>
-        <w:t xml:space="preserve">        smallint nivel "insumo de RN-01"</w:t>
+        <w:t xml:space="preserve">        smallint nivel "insumo de RN-01 · no se copia · el programador lo lee (A-13)"</w:t>
       </w:r>
     </w:p>
     <w:p>
@@ -36889,7 +36902,7 @@
           <w:sz w:val="14"/>
           <w:szCs w:val="14"/>
         </w:rPr>
-        <w:t xml:space="preserve">        bigserial id PK "único emisor de correos"</w:t>
+        <w:t xml:space="preserve">        bigserial id PK "único emisor de correos del sistema · AD-11"</w:t>
       </w:r>
     </w:p>
     <w:p>
@@ -36941,7 +36954,7 @@
           <w:sz w:val="14"/>
           <w:szCs w:val="14"/>
         </w:rPr>
-        <w:t xml:space="preserve">        uuid id PK "datos de referencia"</w:t>
+        <w:t xml:space="preserve">        uuid id PK "dato de referencia"</w:t>
       </w:r>
     </w:p>
     <w:p>
@@ -36993,7 +37006,7 @@
           <w:sz w:val="14"/>
           <w:szCs w:val="14"/>
         </w:rPr>
-        <w:t xml:space="preserve">        uuid id PK "datos de referencia"</w:t>
+        <w:t xml:space="preserve">        uuid id PK "dato de referencia"</w:t>
       </w:r>
     </w:p>
     <w:p>
@@ -37045,7 +37058,7 @@
           <w:sz w:val="14"/>
           <w:szCs w:val="14"/>
         </w:rPr>
-        <w:t xml:space="preserve">        bigserial id PK "versión del plan"</w:t>
+        <w:t xml:space="preserve">        bigserial id PK "versión del plan de estudios"</w:t>
       </w:r>
     </w:p>
     <w:p>
@@ -37136,7 +37149,7 @@
           <w:sz w:val="14"/>
           <w:szCs w:val="14"/>
         </w:rPr>
-        <w:t xml:space="preserve">        bigserial id PK</w:t>
+        <w:t xml:space="preserve">        bigserial id PK "ubica la asignatura en un semestre"</w:t>
       </w:r>
     </w:p>
     <w:p>
@@ -37227,7 +37240,7 @@
           <w:sz w:val="14"/>
           <w:szCs w:val="14"/>
         </w:rPr>
-        <w:t xml:space="preserve">        numeric reputacion_promedio "dato propio de Tutorías"</w:t>
+        <w:t xml:space="preserve">        boolean activo "sincronizado por el programador · A-01 · hasta 5 min de desfase"</w:t>
       </w:r>
     </w:p>
     <w:p>
@@ -37240,7 +37253,7 @@
           <w:sz w:val="14"/>
           <w:szCs w:val="14"/>
         </w:rPr>
-        <w:t xml:space="preserve">    }</w:t>
+        <w:t xml:space="preserve">        numeric reputacion_promedio "dato propio de Tutorías"</w:t>
       </w:r>
     </w:p>
     <w:p>
@@ -37253,7 +37266,7 @@
           <w:sz w:val="14"/>
           <w:szCs w:val="14"/>
         </w:rPr>
-        <w:t xml:space="preserve">    tutorias_asignatura_ref {</w:t>
+        <w:t xml:space="preserve">    }</w:t>
       </w:r>
     </w:p>
     <w:p>
@@ -37266,7 +37279,7 @@
           <w:sz w:val="14"/>
           <w:szCs w:val="14"/>
         </w:rPr>
-        <w:t xml:space="preserve">        uuid asignatura_id PK "copia de lectura"</w:t>
+        <w:t xml:space="preserve">    tutorias_asignatura_ref {</w:t>
       </w:r>
     </w:p>
     <w:p>
@@ -37279,7 +37292,7 @@
           <w:sz w:val="14"/>
           <w:szCs w:val="14"/>
         </w:rPr>
-        <w:t xml:space="preserve">        varchar sigla "15"</w:t>
+        <w:t xml:space="preserve">        uuid asignatura_id PK "copia de lectura"</w:t>
       </w:r>
     </w:p>
     <w:p>
@@ -37292,7 +37305,7 @@
           <w:sz w:val="14"/>
           <w:szCs w:val="14"/>
         </w:rPr>
-        <w:t xml:space="preserve">    }</w:t>
+        <w:t xml:space="preserve">        varchar sigla "15"</w:t>
       </w:r>
     </w:p>
     <w:p>
@@ -37305,7 +37318,7 @@
           <w:sz w:val="14"/>
           <w:szCs w:val="14"/>
         </w:rPr>
-        <w:t xml:space="preserve">    tutorias_perfil_tutor {</w:t>
+        <w:t xml:space="preserve">    }</w:t>
       </w:r>
     </w:p>
     <w:p>
@@ -37318,7 +37331,7 @@
           <w:sz w:val="14"/>
           <w:szCs w:val="14"/>
         </w:rPr>
-        <w:t xml:space="preserve">        uuid id PK</w:t>
+        <w:t xml:space="preserve">    tutorias_perfil_tutor {</w:t>
       </w:r>
     </w:p>
     <w:p>
@@ -37331,7 +37344,7 @@
           <w:sz w:val="14"/>
           <w:szCs w:val="14"/>
         </w:rPr>
-        <w:t xml:space="preserve">        numeric tarifa "la fija el tutor · RN-05"</w:t>
+        <w:t xml:space="preserve">        uuid id PK "una fila por asignatura declarada"</w:t>
       </w:r>
     </w:p>
     <w:p>
@@ -37344,7 +37357,7 @@
           <w:sz w:val="14"/>
           <w:szCs w:val="14"/>
         </w:rPr>
-        <w:t xml:space="preserve">    }</w:t>
+        <w:t xml:space="preserve">        numeric tarifa "la fija el tutor · puede ser 0 · RN-05"</w:t>
       </w:r>
     </w:p>
     <w:p>
@@ -37357,7 +37370,7 @@
           <w:sz w:val="14"/>
           <w:szCs w:val="14"/>
         </w:rPr>
-        <w:t xml:space="preserve">    tutorias_bloque_disponibilidad {</w:t>
+        <w:t xml:space="preserve">    }</w:t>
       </w:r>
     </w:p>
     <w:p>
@@ -37370,7 +37383,7 @@
           <w:sz w:val="14"/>
           <w:szCs w:val="14"/>
         </w:rPr>
-        <w:t xml:space="preserve">        uuid id PK</w:t>
+        <w:t xml:space="preserve">    tutorias_bloque_disponibilidad {</w:t>
       </w:r>
     </w:p>
     <w:p>
@@ -37383,7 +37396,7 @@
           <w:sz w:val="14"/>
           <w:szCs w:val="14"/>
         </w:rPr>
-        <w:t xml:space="preserve">        varchar estado "LIBRE u OCUPADO"</w:t>
+        <w:t xml:space="preserve">        uuid id PK "dos instantes en UTC"</w:t>
       </w:r>
     </w:p>
     <w:p>
@@ -37396,7 +37409,7 @@
           <w:sz w:val="14"/>
           <w:szCs w:val="14"/>
         </w:rPr>
-        <w:t xml:space="preserve">    }</w:t>
+        <w:t xml:space="preserve">        varchar estado "LIBRE u OCUPADO"</w:t>
       </w:r>
     </w:p>
     <w:p>
@@ -37409,7 +37422,7 @@
           <w:sz w:val="14"/>
           <w:szCs w:val="14"/>
         </w:rPr>
-        <w:t xml:space="preserve">    tutorias_reserva {</w:t>
+        <w:t xml:space="preserve">    }</w:t>
       </w:r>
     </w:p>
     <w:p>
@@ -37422,7 +37435,7 @@
           <w:sz w:val="14"/>
           <w:szCs w:val="14"/>
         </w:rPr>
-        <w:t xml:space="preserve">        uuid id PK "cruza a Pagos"</w:t>
+        <w:t xml:space="preserve">    tutorias_reserva {</w:t>
       </w:r>
     </w:p>
     <w:p>
@@ -37435,7 +37448,7 @@
           <w:sz w:val="14"/>
           <w:szCs w:val="14"/>
         </w:rPr>
-        <w:t xml:space="preserve">        varchar estado "máquina de estados"</w:t>
+        <w:t xml:space="preserve">        uuid id PK "cruza a Pagos"</w:t>
       </w:r>
     </w:p>
     <w:p>
@@ -37448,7 +37461,7 @@
           <w:sz w:val="14"/>
           <w:szCs w:val="14"/>
         </w:rPr>
-        <w:t xml:space="preserve">        varchar estado_pago "copia de lectura · puede ser NULL"</w:t>
+        <w:t xml:space="preserve">        varchar estado "máquina de estados de siete valores"</w:t>
       </w:r>
     </w:p>
     <w:p>
@@ -37461,7 +37474,7 @@
           <w:sz w:val="14"/>
           <w:szCs w:val="14"/>
         </w:rPr>
-        <w:t xml:space="preserve">    }</w:t>
+        <w:t xml:space="preserve">        varchar estado_pago "copia de lectura · puede ser NULL"</w:t>
       </w:r>
     </w:p>
     <w:p>
@@ -37474,7 +37487,7 @@
           <w:sz w:val="14"/>
           <w:szCs w:val="14"/>
         </w:rPr>
-        <w:t xml:space="preserve">    tutorias_evaluacion {</w:t>
+        <w:t xml:space="preserve">    }</w:t>
       </w:r>
     </w:p>
     <w:p>
@@ -37487,7 +37500,7 @@
           <w:sz w:val="14"/>
           <w:szCs w:val="14"/>
         </w:rPr>
-        <w:t xml:space="preserve">        uuid id PK</w:t>
+        <w:t xml:space="preserve">    tutorias_evaluacion {</w:t>
       </w:r>
     </w:p>
     <w:p>
@@ -37500,7 +37513,7 @@
           <w:sz w:val="14"/>
           <w:szCs w:val="14"/>
         </w:rPr>
-        <w:t xml:space="preserve">        smallint calificacion "1 a 5"</w:t>
+        <w:t xml:space="preserve">        uuid id PK "una por reserva"</w:t>
       </w:r>
     </w:p>
     <w:p>
@@ -37513,7 +37526,7 @@
           <w:sz w:val="14"/>
           <w:szCs w:val="14"/>
         </w:rPr>
-        <w:t xml:space="preserve">    }</w:t>
+        <w:t xml:space="preserve">        smallint calificacion "1 a 5"</w:t>
       </w:r>
     </w:p>
     <w:p>
@@ -37526,7 +37539,7 @@
           <w:sz w:val="14"/>
           <w:szCs w:val="14"/>
         </w:rPr>
-        <w:t xml:space="preserve">    pagos_pago {</w:t>
+        <w:t xml:space="preserve">    }</w:t>
       </w:r>
     </w:p>
     <w:p>
@@ -37539,7 +37552,7 @@
           <w:sz w:val="14"/>
           <w:szCs w:val="14"/>
         </w:rPr>
-        <w:t xml:space="preserve">        uuid id PK</w:t>
+        <w:t xml:space="preserve">    pagos_pago {</w:t>
       </w:r>
     </w:p>
     <w:p>
@@ -37552,7 +37565,7 @@
           <w:sz w:val="14"/>
           <w:szCs w:val="14"/>
         </w:rPr>
-        <w:t xml:space="preserve">        uuid reserva_id UK "referencia lógica"</w:t>
+        <w:t xml:space="preserve">        uuid id PK "un pago por reserva"</w:t>
       </w:r>
     </w:p>
     <w:p>
@@ -37565,7 +37578,7 @@
           <w:sz w:val="14"/>
           <w:szCs w:val="14"/>
         </w:rPr>
-        <w:t xml:space="preserve">        varchar estado "fuente de verdad del pago"</w:t>
+        <w:t xml:space="preserve">        uuid reserva_id UK "referencia lógica"</w:t>
       </w:r>
     </w:p>
     <w:p>
@@ -37578,7 +37591,7 @@
           <w:sz w:val="14"/>
           <w:szCs w:val="14"/>
         </w:rPr>
-        <w:t xml:space="preserve">    }</w:t>
+        <w:t xml:space="preserve">        varchar estado "fuente de verdad del pago"</w:t>
       </w:r>
     </w:p>
     <w:p>
@@ -37591,7 +37604,7 @@
           <w:sz w:val="14"/>
           <w:szCs w:val="14"/>
         </w:rPr>
-        <w:t xml:space="preserve">    identidad_usuario ||--o{ identidad_aviso_correo : "FK real en identity_db"</w:t>
+        <w:t xml:space="preserve">    }</w:t>
       </w:r>
     </w:p>
     <w:p>
@@ -37604,7 +37617,7 @@
           <w:sz w:val="14"/>
           <w:szCs w:val="14"/>
         </w:rPr>
-        <w:t xml:space="preserve">    catalogo_carrera ||--o{ catalogo_malla : "FK real en catalog_db"</w:t>
+        <w:t xml:space="preserve">    identidad_usuario ||--o{ identidad_aviso_correo : "FK real en identity_db"</w:t>
       </w:r>
     </w:p>
     <w:p>
@@ -37617,7 +37630,7 @@
           <w:sz w:val="14"/>
           <w:szCs w:val="14"/>
         </w:rPr>
-        <w:t xml:space="preserve">    catalogo_malla ||--o{ catalogo_malla_asignatura : "FK real en catalog_db"</w:t>
+        <w:t xml:space="preserve">    catalogo_carrera ||--o{ catalogo_malla : "FK real en catalog_db"</w:t>
       </w:r>
     </w:p>
     <w:p>
@@ -37630,7 +37643,7 @@
           <w:sz w:val="14"/>
           <w:szCs w:val="14"/>
         </w:rPr>
-        <w:t xml:space="preserve">    catalogo_asignatura ||--o{ catalogo_malla_asignatura : "FK real en catalog_db"</w:t>
+        <w:t xml:space="preserve">    catalogo_malla ||--o{ catalogo_malla_asignatura : "FK real en catalog_db"</w:t>
       </w:r>
     </w:p>
     <w:p>
@@ -37643,7 +37656,7 @@
           <w:sz w:val="14"/>
           <w:szCs w:val="14"/>
         </w:rPr>
-        <w:t xml:space="preserve">    tutorias_usuario_ref ||--o{ tutorias_perfil_tutor : "FK real en tutoring_db"</w:t>
+        <w:t xml:space="preserve">    catalogo_asignatura ||--o{ catalogo_malla_asignatura : "FK real en catalog_db"</w:t>
       </w:r>
     </w:p>
     <w:p>
@@ -37656,7 +37669,7 @@
           <w:sz w:val="14"/>
           <w:szCs w:val="14"/>
         </w:rPr>
-        <w:t xml:space="preserve">    tutorias_asignatura_ref ||--o{ tutorias_perfil_tutor : "FK real en tutoring_db"</w:t>
+        <w:t xml:space="preserve">    tutorias_usuario_ref ||--o{ tutorias_perfil_tutor : "FK real en tutoring_db"</w:t>
       </w:r>
     </w:p>
     <w:p>
@@ -37669,7 +37682,7 @@
           <w:sz w:val="14"/>
           <w:szCs w:val="14"/>
         </w:rPr>
-        <w:t xml:space="preserve">    tutorias_usuario_ref ||--o{ tutorias_bloque_disponibilidad : "FK real en tutoring_db"</w:t>
+        <w:t xml:space="preserve">    tutorias_asignatura_ref ||--o{ tutorias_perfil_tutor : "FK real en tutoring_db"</w:t>
       </w:r>
     </w:p>
     <w:p>
@@ -37682,7 +37695,7 @@
           <w:sz w:val="14"/>
           <w:szCs w:val="14"/>
         </w:rPr>
-        <w:t xml:space="preserve">    tutorias_bloque_disponibilidad ||--o{ tutorias_reserva : "FK real en tutoring_db"</w:t>
+        <w:t xml:space="preserve">    tutorias_usuario_ref ||--o{ tutorias_bloque_disponibilidad : "FK real en tutoring_db"</w:t>
       </w:r>
     </w:p>
     <w:p>
@@ -37695,7 +37708,7 @@
           <w:sz w:val="14"/>
           <w:szCs w:val="14"/>
         </w:rPr>
-        <w:t xml:space="preserve">    tutorias_usuario_ref ||--o{ tutorias_reserva : "FK real · tutor y solicitante"</w:t>
+        <w:t xml:space="preserve">    tutorias_bloque_disponibilidad ||--o{ tutorias_reserva : "FK real en tutoring_db"</w:t>
       </w:r>
     </w:p>
     <w:p>
@@ -37708,7 +37721,7 @@
           <w:sz w:val="14"/>
           <w:szCs w:val="14"/>
         </w:rPr>
-        <w:t xml:space="preserve">    tutorias_reserva ||--o| tutorias_evaluacion : "FK real en tutoring_db"</w:t>
+        <w:t xml:space="preserve">    tutorias_usuario_ref ||--o{ tutorias_reserva : "FK real · tutor y solicitante"</w:t>
       </w:r>
     </w:p>
     <w:p>
@@ -37721,7 +37734,7 @@
           <w:sz w:val="14"/>
           <w:szCs w:val="14"/>
         </w:rPr>
-        <w:t xml:space="preserve">    identidad_usuario ||..|| tutorias_usuario_ref : "llamada 2 · copia nombre, sede y activo"</w:t>
+        <w:t xml:space="preserve">    tutorias_reserva ||--o| tutorias_evaluacion : "FK real en tutoring_db"</w:t>
       </w:r>
     </w:p>
     <w:p>
@@ -37734,7 +37747,7 @@
           <w:sz w:val="14"/>
           <w:szCs w:val="14"/>
         </w:rPr>
-        <w:t xml:space="preserve">    catalogo_carrera ||..o{ tutorias_usuario_ref : "llamada 1 · copia carrera_nombre"</w:t>
+        <w:t xml:space="preserve">    identidad_usuario ||..o| tutorias_usuario_ref : "llamada 2 · nace al primer contacto con Tutorías"</w:t>
       </w:r>
     </w:p>
     <w:p>
@@ -37747,7 +37760,7 @@
           <w:sz w:val="14"/>
           <w:szCs w:val="14"/>
         </w:rPr>
-        <w:t xml:space="preserve">    catalogo_sede ||..o{ tutorias_usuario_ref : "llamada 1 · copia sede_nombre"</w:t>
+        <w:t xml:space="preserve">    catalogo_carrera ||..o{ tutorias_usuario_ref : "llamada 1 · copia carrera_nombre"</w:t>
       </w:r>
     </w:p>
     <w:p>
@@ -37760,7 +37773,7 @@
           <w:sz w:val="14"/>
           <w:szCs w:val="14"/>
         </w:rPr>
-        <w:t xml:space="preserve">    catalogo_asignatura ||..|| tutorias_asignatura_ref : "llamada 1 · copia sigla y nombre"</w:t>
+        <w:t xml:space="preserve">    catalogo_sede ||..o{ tutorias_usuario_ref : "llamada 1 · copia sede_nombre"</w:t>
       </w:r>
     </w:p>
     <w:p>
@@ -37773,7 +37786,7 @@
           <w:sz w:val="14"/>
           <w:szCs w:val="14"/>
         </w:rPr>
-        <w:t xml:space="preserve">    catalogo_malla_asignatura }o..o{ tutorias_perfil_tutor : "llamada 1 · valida RN-01 al declarar"</w:t>
+        <w:t xml:space="preserve">    catalogo_asignatura ||..o| tutorias_asignatura_ref : "llamada 1 · copia sigla y nombre"</w:t>
       </w:r>
     </w:p>
     <w:p>
@@ -37786,7 +37799,7 @@
           <w:sz w:val="14"/>
           <w:szCs w:val="14"/>
         </w:rPr>
-        <w:t xml:space="preserve">    identidad_usuario }o..|| catalogo_carrera : "carrera_id · sin integridad referencial"</w:t>
+        <w:t xml:space="preserve">    catalogo_malla_asignatura }o..o{ tutorias_perfil_tutor : "llamada 1 · valida RN-01 al declarar"</w:t>
       </w:r>
     </w:p>
     <w:p>
@@ -37799,7 +37812,20 @@
           <w:sz w:val="14"/>
           <w:szCs w:val="14"/>
         </w:rPr>
-        <w:t xml:space="preserve">    identidad_usuario }o..|| catalogo_sede : "sede_id · sin integridad referencial"</w:t>
+        <w:t xml:space="preserve">    identidad_usuario }o..o| catalogo_carrera : "carrera_id · sin integridad referencial"</w:t>
+      </w:r>
+    </w:p>
+    <w:p>
+      <w:pPr>
+        <w:spacing w:after="0"/>
+      </w:pPr>
+      <w:r>
+        <w:rPr>
+          <w:rFonts w:ascii="Consolas" w:cs="Consolas" w:eastAsia="Consolas" w:hAnsi="Consolas"/>
+          <w:sz w:val="14"/>
+          <w:szCs w:val="14"/>
+        </w:rPr>
+        <w:t xml:space="preserve">    identidad_usuario }o..o| catalogo_sede : "sede_id · sin integridad referencial"</w:t>
       </w:r>
     </w:p>
     <w:p>
@@ -37958,7 +37984,7 @@
                 <w:sz w:val="17"/>
                 <w:szCs w:val="17"/>
               </w:rPr>
-              <w:t xml:space="preserve">Identidad guarda el identificador y no el nombre. Valida que exista al registrar; si Catálogo no responde, acepta el valor y la validación queda pendiente. No hay borrado en cascada posible: una carrera se desactiva, no se borra.</w:t>
+              <w:t xml:space="preserve">Identidad guarda el identificador y no el nombre, y no lo valida contra Catálogo (AD-15 del Pilar 2): el formulario de perfil solo ofrece valores de GET /carreras y GET /sedes, y la carrera se valida donde se usa, cuando Tutorías pide la malla para RN-01. Un identificador inventado por fuera de la interfaz queda guardado, pero no habilita ninguna asignatura ni muestra ninguna sede. No hay borrado en cascada posible: una carrera se desactiva, no se borra.</w:t>
             </w:r>
           </w:p>
         </w:tc>
@@ -38301,7 +38327,7 @@
           <w:sz w:val="20"/>
           <w:szCs w:val="20"/>
         </w:rPr>
-        <w:t xml:space="preserve">Guardar los cinco diagramas en docs/diagramas/ como archivos .mmd, para que se rendericen en el repositorio y se puedan versionar como texto.</w:t>
+        <w:t xml:space="preserve">Subir los cinco diagramas al repositorio: ya están escritos como archivos .mmd, con su .png, en docs/diagramas/ de la carpeta del proyecto, pero esa carpeta todavía no existe en el repositorio.</w:t>
       </w:r>
     </w:p>
     <w:sectPr>

</xml_diff>